<commit_message>
FIRST launch for GUI logiciel - 1|13|04|2026
</commit_message>
<xml_diff>
--- a/Docs/PFE-MASTER.docx
+++ b/Docs/PFE-MASTER.docx
@@ -1307,12 +1307,14 @@
         <w:rPr>
           <w:b/>
           <w:bCs/>
-        </w:rPr>
-      </w:pPr>
-      <w:r>
-        <w:rPr>
-          <w:b/>
-          <w:bCs/>
+          <w:lang w:val="fr-FR"/>
+        </w:rPr>
+      </w:pPr>
+      <w:r>
+        <w:rPr>
+          <w:b/>
+          <w:bCs/>
+          <w:lang w:val="fr-FR"/>
         </w:rPr>
         <w:t>PLC</w:t>
       </w:r>
@@ -1333,12 +1335,14 @@
         <w:rPr>
           <w:b/>
           <w:bCs/>
-        </w:rPr>
-      </w:pPr>
-      <w:r>
-        <w:rPr>
-          <w:b/>
-          <w:bCs/>
+          <w:lang w:val="fr-FR"/>
+        </w:rPr>
+      </w:pPr>
+      <w:r>
+        <w:rPr>
+          <w:b/>
+          <w:bCs/>
+          <w:lang w:val="fr-FR"/>
         </w:rPr>
         <w:t>Capteurs et actionneurs</w:t>
       </w:r>
@@ -1363,12 +1367,14 @@
         <w:rPr>
           <w:b/>
           <w:bCs/>
-        </w:rPr>
-      </w:pPr>
-      <w:r>
-        <w:rPr>
-          <w:b/>
-          <w:bCs/>
+          <w:lang w:val="fr-FR"/>
+        </w:rPr>
+      </w:pPr>
+      <w:r>
+        <w:rPr>
+          <w:b/>
+          <w:bCs/>
+          <w:lang w:val="fr-FR"/>
         </w:rPr>
         <w:t>Réseau industriel</w:t>
       </w:r>
@@ -1389,12 +1395,14 @@
         <w:rPr>
           <w:b/>
           <w:bCs/>
-        </w:rPr>
-      </w:pPr>
-      <w:r>
-        <w:rPr>
-          <w:b/>
-          <w:bCs/>
+          <w:lang w:val="fr-FR"/>
+        </w:rPr>
+      </w:pPr>
+      <w:r>
+        <w:rPr>
+          <w:b/>
+          <w:bCs/>
+          <w:lang w:val="fr-FR"/>
         </w:rPr>
         <w:t>Supervision (HMI)</w:t>
       </w:r>
@@ -2645,13 +2653,55 @@
         <w:spacing w:before="0" w:beforeAutospacing="0"/>
       </w:pPr>
     </w:p>
-    <w:p/>
-    <w:p/>
-    <w:p/>
-    <w:p/>
-    <w:p/>
-    <w:p/>
-    <w:p/>
+    <w:p>
+      <w:pPr>
+        <w:rPr>
+          <w:lang w:val="fr-FR"/>
+        </w:rPr>
+      </w:pPr>
+    </w:p>
+    <w:p>
+      <w:pPr>
+        <w:rPr>
+          <w:lang w:val="fr-FR"/>
+        </w:rPr>
+      </w:pPr>
+    </w:p>
+    <w:p>
+      <w:pPr>
+        <w:rPr>
+          <w:lang w:val="fr-FR"/>
+        </w:rPr>
+      </w:pPr>
+    </w:p>
+    <w:p>
+      <w:pPr>
+        <w:rPr>
+          <w:lang w:val="fr-FR"/>
+        </w:rPr>
+      </w:pPr>
+    </w:p>
+    <w:p>
+      <w:pPr>
+        <w:rPr>
+          <w:lang w:val="fr-FR"/>
+        </w:rPr>
+      </w:pPr>
+    </w:p>
+    <w:p>
+      <w:pPr>
+        <w:rPr>
+          <w:lang w:val="fr-FR"/>
+        </w:rPr>
+      </w:pPr>
+    </w:p>
+    <w:p>
+      <w:pPr>
+        <w:rPr>
+          <w:lang w:val="fr-FR"/>
+        </w:rPr>
+      </w:pPr>
+    </w:p>
     <w:p>
       <w:pPr>
         <w:spacing w:after="0" w:line="360" w:lineRule="auto"/>
@@ -2753,828 +2803,229 @@
     </w:p>
     <w:p>
       <w:pPr>
-        <w:spacing w:before="100" w:beforeAutospacing="1" w:after="100" w:afterAutospacing="1" w:line="240" w:lineRule="auto"/>
-        <w:rPr>
-          <w:rFonts w:ascii="Times New Roman" w:eastAsia="Times New Roman" w:hAnsi="Times New Roman" w:cs="Times New Roman"/>
-          <w:noProof w:val="0"/>
-          <w:sz w:val="24"/>
-          <w:szCs w:val="24"/>
-          <w:lang w:val="fr-FR" w:eastAsia="fr-FR"/>
-        </w:rPr>
-      </w:pPr>
-      <w:r>
-        <w:rPr>
-          <w:rFonts w:ascii="Times New Roman" w:eastAsia="Times New Roman" w:hAnsi="Times New Roman" w:cs="Times New Roman"/>
-          <w:noProof w:val="0"/>
-          <w:sz w:val="24"/>
-          <w:szCs w:val="24"/>
-          <w:lang w:val="fr-FR" w:eastAsia="fr-FR"/>
-        </w:rPr>
-        <w:t xml:space="preserve">Dans le cadre de ce projet, l’objectif est de développer un </w:t>
-      </w:r>
-      <w:r>
-        <w:rPr>
-          <w:rFonts w:ascii="Times New Roman" w:eastAsia="Times New Roman" w:hAnsi="Times New Roman" w:cs="Times New Roman"/>
-          <w:b/>
-          <w:bCs/>
-          <w:noProof w:val="0"/>
-          <w:sz w:val="24"/>
-          <w:szCs w:val="24"/>
-          <w:lang w:val="fr-FR" w:eastAsia="fr-FR"/>
-        </w:rPr>
-        <w:t>logiciel intelligent pour auditer la sécurité des systèmes SCADA</w:t>
-      </w:r>
-      <w:r>
-        <w:rPr>
-          <w:rFonts w:ascii="Times New Roman" w:eastAsia="Times New Roman" w:hAnsi="Times New Roman" w:cs="Times New Roman"/>
-          <w:noProof w:val="0"/>
-          <w:sz w:val="24"/>
-          <w:szCs w:val="24"/>
-          <w:lang w:val="fr-FR" w:eastAsia="fr-FR"/>
-        </w:rPr>
-        <w:t xml:space="preserve">. Avant de pouvoir détecter les anomalies, il est nécessaire de créer un </w:t>
-      </w:r>
-      <w:r>
-        <w:rPr>
-          <w:rFonts w:ascii="Times New Roman" w:eastAsia="Times New Roman" w:hAnsi="Times New Roman" w:cs="Times New Roman"/>
-          <w:b/>
-          <w:bCs/>
-          <w:noProof w:val="0"/>
-          <w:sz w:val="24"/>
-          <w:szCs w:val="24"/>
-          <w:lang w:val="fr-FR" w:eastAsia="fr-FR"/>
-        </w:rPr>
-        <w:t>environnement industriel simulé</w:t>
-      </w:r>
-      <w:r>
-        <w:rPr>
-          <w:rFonts w:ascii="Times New Roman" w:eastAsia="Times New Roman" w:hAnsi="Times New Roman" w:cs="Times New Roman"/>
-          <w:noProof w:val="0"/>
-          <w:sz w:val="24"/>
-          <w:szCs w:val="24"/>
-          <w:lang w:val="fr-FR" w:eastAsia="fr-FR"/>
-        </w:rPr>
-        <w:t>.</w:t>
-      </w:r>
-    </w:p>
-    <w:p>
-      <w:pPr>
-        <w:spacing w:before="100" w:beforeAutospacing="1" w:after="100" w:afterAutospacing="1" w:line="240" w:lineRule="auto"/>
-        <w:rPr>
-          <w:rFonts w:ascii="Times New Roman" w:eastAsia="Times New Roman" w:hAnsi="Times New Roman" w:cs="Times New Roman"/>
-          <w:noProof w:val="0"/>
-          <w:sz w:val="24"/>
-          <w:szCs w:val="24"/>
-          <w:lang w:val="fr-FR" w:eastAsia="fr-FR"/>
-        </w:rPr>
-      </w:pPr>
-      <w:r>
-        <w:rPr>
-          <w:rFonts w:ascii="Times New Roman" w:eastAsia="Times New Roman" w:hAnsi="Times New Roman" w:cs="Times New Roman"/>
-          <w:noProof w:val="0"/>
-          <w:sz w:val="24"/>
-          <w:szCs w:val="24"/>
-          <w:lang w:val="fr-FR" w:eastAsia="fr-FR"/>
-        </w:rPr>
-        <w:t xml:space="preserve">Cette simulation permet de reproduire le comportement d’un </w:t>
-      </w:r>
-      <w:r>
-        <w:rPr>
-          <w:rFonts w:ascii="Times New Roman" w:eastAsia="Times New Roman" w:hAnsi="Times New Roman" w:cs="Times New Roman"/>
-          <w:b/>
-          <w:bCs/>
-          <w:noProof w:val="0"/>
-          <w:sz w:val="24"/>
-          <w:szCs w:val="24"/>
-          <w:lang w:val="fr-FR" w:eastAsia="fr-FR"/>
-        </w:rPr>
-        <w:t>PLC (Programmable Logic Controller)</w:t>
-      </w:r>
-      <w:r>
-        <w:rPr>
-          <w:rFonts w:ascii="Times New Roman" w:eastAsia="Times New Roman" w:hAnsi="Times New Roman" w:cs="Times New Roman"/>
-          <w:noProof w:val="0"/>
-          <w:sz w:val="24"/>
-          <w:szCs w:val="24"/>
-          <w:lang w:val="fr-FR" w:eastAsia="fr-FR"/>
-        </w:rPr>
-        <w:t xml:space="preserve"> et des </w:t>
-      </w:r>
-      <w:r>
-        <w:rPr>
-          <w:rFonts w:ascii="Times New Roman" w:eastAsia="Times New Roman" w:hAnsi="Times New Roman" w:cs="Times New Roman"/>
-          <w:b/>
-          <w:bCs/>
-          <w:noProof w:val="0"/>
-          <w:sz w:val="24"/>
-          <w:szCs w:val="24"/>
-          <w:lang w:val="fr-FR" w:eastAsia="fr-FR"/>
-        </w:rPr>
-        <w:t>variables industrielles</w:t>
-      </w:r>
-      <w:r>
-        <w:rPr>
-          <w:rFonts w:ascii="Times New Roman" w:eastAsia="Times New Roman" w:hAnsi="Times New Roman" w:cs="Times New Roman"/>
-          <w:noProof w:val="0"/>
-          <w:sz w:val="24"/>
-          <w:szCs w:val="24"/>
-          <w:lang w:val="fr-FR" w:eastAsia="fr-FR"/>
-        </w:rPr>
-        <w:t xml:space="preserve"> comme la température, la pression, la vitesse d’un moteur et l’état marche/arrêt.</w:t>
-      </w:r>
-    </w:p>
-    <w:p>
-      <w:pPr>
-        <w:spacing w:before="100" w:beforeAutospacing="1" w:after="100" w:afterAutospacing="1" w:line="240" w:lineRule="auto"/>
-        <w:rPr>
-          <w:rFonts w:ascii="Times New Roman" w:eastAsia="Times New Roman" w:hAnsi="Times New Roman" w:cs="Times New Roman"/>
-          <w:noProof w:val="0"/>
-          <w:sz w:val="24"/>
-          <w:szCs w:val="24"/>
-          <w:lang w:val="fr-FR" w:eastAsia="fr-FR"/>
-        </w:rPr>
-      </w:pPr>
-      <w:r>
-        <w:rPr>
-          <w:rFonts w:ascii="Times New Roman" w:eastAsia="Times New Roman" w:hAnsi="Times New Roman" w:cs="Times New Roman"/>
-          <w:noProof w:val="0"/>
-          <w:sz w:val="24"/>
-          <w:szCs w:val="24"/>
-          <w:lang w:val="fr-FR" w:eastAsia="fr-FR"/>
-        </w:rPr>
-        <w:t>Se</w:t>
-      </w:r>
-      <w:r>
-        <w:rPr>
-          <w:rFonts w:ascii="Times New Roman" w:eastAsia="Times New Roman" w:hAnsi="Times New Roman" w:cs="Times New Roman"/>
-          <w:noProof w:val="0"/>
-          <w:sz w:val="24"/>
-          <w:szCs w:val="24"/>
-          <w:lang w:val="fr-FR" w:eastAsia="fr-FR"/>
-        </w:rPr>
-        <w:t xml:space="preserve"> concentre sur </w:t>
-      </w:r>
-      <w:r>
-        <w:rPr>
-          <w:rFonts w:ascii="Times New Roman" w:eastAsia="Times New Roman" w:hAnsi="Times New Roman" w:cs="Times New Roman"/>
-          <w:b/>
-          <w:bCs/>
-          <w:noProof w:val="0"/>
-          <w:sz w:val="24"/>
-          <w:szCs w:val="24"/>
-          <w:lang w:val="fr-FR" w:eastAsia="fr-FR"/>
-        </w:rPr>
-        <w:t>la création de cet environnement</w:t>
-      </w:r>
-      <w:r>
-        <w:rPr>
-          <w:rFonts w:ascii="Times New Roman" w:eastAsia="Times New Roman" w:hAnsi="Times New Roman" w:cs="Times New Roman"/>
-          <w:noProof w:val="0"/>
-          <w:sz w:val="24"/>
-          <w:szCs w:val="24"/>
-          <w:lang w:val="fr-FR" w:eastAsia="fr-FR"/>
-        </w:rPr>
-        <w:t>, afin de pouvoir :</w:t>
-      </w:r>
-    </w:p>
-    <w:p>
-      <w:pPr>
-        <w:numPr>
-          <w:ilvl w:val="0"/>
-          <w:numId w:val="9"/>
-        </w:numPr>
-        <w:spacing w:before="100" w:beforeAutospacing="1" w:after="100" w:afterAutospacing="1" w:line="240" w:lineRule="auto"/>
-        <w:rPr>
-          <w:rFonts w:ascii="Times New Roman" w:eastAsia="Times New Roman" w:hAnsi="Times New Roman" w:cs="Times New Roman"/>
-          <w:noProof w:val="0"/>
-          <w:sz w:val="24"/>
-          <w:szCs w:val="24"/>
-          <w:lang w:val="fr-FR" w:eastAsia="fr-FR"/>
-        </w:rPr>
-      </w:pPr>
-      <w:r>
-        <w:rPr>
-          <w:rFonts w:ascii="Times New Roman" w:eastAsia="Times New Roman" w:hAnsi="Times New Roman" w:cs="Times New Roman"/>
-          <w:noProof w:val="0"/>
-          <w:sz w:val="24"/>
-          <w:szCs w:val="24"/>
-          <w:lang w:val="fr-FR" w:eastAsia="fr-FR"/>
-        </w:rPr>
-        <w:t>Générer des données normales et fiables</w:t>
-      </w:r>
-    </w:p>
-    <w:p>
-      <w:pPr>
-        <w:numPr>
-          <w:ilvl w:val="0"/>
-          <w:numId w:val="9"/>
-        </w:numPr>
-        <w:spacing w:before="100" w:beforeAutospacing="1" w:after="100" w:afterAutospacing="1" w:line="240" w:lineRule="auto"/>
-        <w:rPr>
-          <w:rFonts w:ascii="Times New Roman" w:eastAsia="Times New Roman" w:hAnsi="Times New Roman" w:cs="Times New Roman"/>
-          <w:noProof w:val="0"/>
-          <w:sz w:val="24"/>
-          <w:szCs w:val="24"/>
-          <w:lang w:val="fr-FR" w:eastAsia="fr-FR"/>
-        </w:rPr>
-      </w:pPr>
-      <w:r>
-        <w:rPr>
-          <w:rFonts w:ascii="Times New Roman" w:eastAsia="Times New Roman" w:hAnsi="Times New Roman" w:cs="Times New Roman"/>
-          <w:noProof w:val="0"/>
-          <w:sz w:val="24"/>
-          <w:szCs w:val="24"/>
-          <w:lang w:val="fr-FR" w:eastAsia="fr-FR"/>
-        </w:rPr>
-        <w:t>Simuler des comportements anormaux ou malveillants (malware industriel)</w:t>
-      </w:r>
-    </w:p>
-    <w:p>
-      <w:pPr>
-        <w:numPr>
-          <w:ilvl w:val="0"/>
-          <w:numId w:val="9"/>
-        </w:numPr>
-        <w:spacing w:before="100" w:beforeAutospacing="1" w:after="100" w:afterAutospacing="1" w:line="240" w:lineRule="auto"/>
-        <w:rPr>
-          <w:rFonts w:ascii="Times New Roman" w:eastAsia="Times New Roman" w:hAnsi="Times New Roman" w:cs="Times New Roman"/>
-          <w:noProof w:val="0"/>
-          <w:sz w:val="24"/>
-          <w:szCs w:val="24"/>
-          <w:lang w:val="fr-FR" w:eastAsia="fr-FR"/>
-        </w:rPr>
-      </w:pPr>
-      <w:r>
-        <w:rPr>
-          <w:rFonts w:ascii="Times New Roman" w:eastAsia="Times New Roman" w:hAnsi="Times New Roman" w:cs="Times New Roman"/>
-          <w:noProof w:val="0"/>
-          <w:sz w:val="24"/>
-          <w:szCs w:val="24"/>
-          <w:lang w:val="fr-FR" w:eastAsia="fr-FR"/>
-        </w:rPr>
-        <w:t xml:space="preserve">Tester la communication via le protocole </w:t>
-      </w:r>
-      <w:r>
-        <w:rPr>
-          <w:rFonts w:ascii="Times New Roman" w:eastAsia="Times New Roman" w:hAnsi="Times New Roman" w:cs="Times New Roman"/>
-          <w:b/>
-          <w:bCs/>
-          <w:noProof w:val="0"/>
-          <w:sz w:val="24"/>
-          <w:szCs w:val="24"/>
-          <w:lang w:val="fr-FR" w:eastAsia="fr-FR"/>
-        </w:rPr>
-        <w:t>Modbus TCP</w:t>
-      </w:r>
-    </w:p>
-    <w:p>
-      <w:pPr>
-        <w:numPr>
-          <w:ilvl w:val="0"/>
-          <w:numId w:val="9"/>
-        </w:numPr>
-        <w:spacing w:before="100" w:beforeAutospacing="1" w:after="100" w:afterAutospacing="1" w:line="240" w:lineRule="auto"/>
-        <w:rPr>
-          <w:rFonts w:ascii="Times New Roman" w:eastAsia="Times New Roman" w:hAnsi="Times New Roman" w:cs="Times New Roman"/>
-          <w:noProof w:val="0"/>
-          <w:sz w:val="24"/>
-          <w:szCs w:val="24"/>
-          <w:lang w:val="fr-FR" w:eastAsia="fr-FR"/>
-        </w:rPr>
-      </w:pPr>
-      <w:r>
-        <w:rPr>
-          <w:rFonts w:ascii="Times New Roman" w:eastAsia="Times New Roman" w:hAnsi="Times New Roman" w:cs="Times New Roman"/>
-          <w:noProof w:val="0"/>
-          <w:sz w:val="24"/>
-          <w:szCs w:val="24"/>
-          <w:lang w:val="fr-FR" w:eastAsia="fr-FR"/>
-        </w:rPr>
-        <w:t xml:space="preserve">Préparer les données pour la phase suivante : la </w:t>
-      </w:r>
-      <w:r>
-        <w:rPr>
-          <w:rFonts w:ascii="Times New Roman" w:eastAsia="Times New Roman" w:hAnsi="Times New Roman" w:cs="Times New Roman"/>
-          <w:b/>
-          <w:bCs/>
-          <w:noProof w:val="0"/>
-          <w:sz w:val="24"/>
-          <w:szCs w:val="24"/>
-          <w:lang w:val="fr-FR" w:eastAsia="fr-FR"/>
-        </w:rPr>
-        <w:t>détection et l’analyse des anomalies</w:t>
-      </w:r>
-    </w:p>
-    <w:p>
-      <w:pPr>
-        <w:spacing w:before="100" w:beforeAutospacing="1" w:after="100" w:afterAutospacing="1" w:line="240" w:lineRule="auto"/>
-        <w:rPr>
-          <w:rFonts w:ascii="Times New Roman" w:eastAsia="Times New Roman" w:hAnsi="Times New Roman" w:cs="Times New Roman"/>
-          <w:noProof w:val="0"/>
-          <w:sz w:val="24"/>
-          <w:szCs w:val="24"/>
-          <w:lang w:val="fr-FR" w:eastAsia="fr-FR"/>
-        </w:rPr>
-      </w:pPr>
-      <w:r>
-        <w:rPr>
-          <w:rFonts w:ascii="Times New Roman" w:eastAsia="Times New Roman" w:hAnsi="Times New Roman" w:cs="Times New Roman"/>
-          <w:noProof w:val="0"/>
-          <w:sz w:val="24"/>
-          <w:szCs w:val="24"/>
-          <w:lang w:val="fr-FR" w:eastAsia="fr-FR"/>
-        </w:rPr>
-        <w:t xml:space="preserve">Cette approche permet de travailler sans matériel réel, ce qui est </w:t>
-      </w:r>
-      <w:r>
-        <w:rPr>
-          <w:rFonts w:ascii="Times New Roman" w:eastAsia="Times New Roman" w:hAnsi="Times New Roman" w:cs="Times New Roman"/>
-          <w:b/>
-          <w:bCs/>
-          <w:noProof w:val="0"/>
-          <w:sz w:val="24"/>
-          <w:szCs w:val="24"/>
-          <w:lang w:val="fr-FR" w:eastAsia="fr-FR"/>
-        </w:rPr>
-        <w:t>moins coûteux, plus sûr et flexible</w:t>
-      </w:r>
-      <w:r>
-        <w:rPr>
-          <w:rFonts w:ascii="Times New Roman" w:eastAsia="Times New Roman" w:hAnsi="Times New Roman" w:cs="Times New Roman"/>
-          <w:noProof w:val="0"/>
-          <w:sz w:val="24"/>
-          <w:szCs w:val="24"/>
-          <w:lang w:val="fr-FR" w:eastAsia="fr-FR"/>
-        </w:rPr>
-        <w:t>.</w:t>
-      </w:r>
-    </w:p>
-    <w:p>
-      <w:pPr>
-        <w:spacing w:after="0" w:line="360" w:lineRule="auto"/>
-        <w:outlineLvl w:val="1"/>
-        <w:rPr>
-          <w:rFonts w:ascii="Times New Roman" w:eastAsia="Times New Roman" w:hAnsi="Times New Roman" w:cs="Times New Roman"/>
-          <w:b/>
-          <w:bCs/>
-          <w:noProof w:val="0"/>
+        <w:shd w:val="clear" w:color="auto" w:fill="FFFFFF"/>
+        <w:spacing w:beforeAutospacing="1" w:after="0" w:afterAutospacing="1" w:line="240" w:lineRule="auto"/>
+        <w:rPr>
+          <w:rFonts w:ascii="Segoe UI" w:eastAsia="Times New Roman" w:hAnsi="Segoe UI" w:cs="Segoe UI"/>
+          <w:noProof w:val="0"/>
+          <w:color w:val="0D0D0D"/>
+          <w:sz w:val="24"/>
+          <w:szCs w:val="24"/>
+          <w:lang w:val="fr-FR" w:eastAsia="fr-FR"/>
+        </w:rPr>
+      </w:pPr>
+      <w:r>
+        <w:rPr>
+          <w:rFonts w:ascii="Segoe UI" w:eastAsia="Times New Roman" w:hAnsi="Segoe UI" w:cs="Segoe UI"/>
+          <w:noProof w:val="0"/>
+          <w:color w:val="0D0D0D"/>
+          <w:sz w:val="24"/>
+          <w:szCs w:val="24"/>
+          <w:lang w:val="fr-FR" w:eastAsia="fr-FR"/>
+        </w:rPr>
+        <w:t xml:space="preserve">Les systèmes industriels modernes reposent sur des architectures distribuées permettant la supervision et le contrôle des </w:t>
+      </w:r>
+      <w:proofErr w:type="spellStart"/>
+      <w:r>
+        <w:rPr>
+          <w:rFonts w:ascii="Segoe UI" w:eastAsia="Times New Roman" w:hAnsi="Segoe UI" w:cs="Segoe UI"/>
+          <w:noProof w:val="0"/>
+          <w:color w:val="0D0D0D"/>
+          <w:sz w:val="24"/>
+          <w:szCs w:val="24"/>
+          <w:lang w:val="fr-FR" w:eastAsia="fr-FR"/>
+        </w:rPr>
+        <w:t>პროცესus</w:t>
+      </w:r>
+      <w:proofErr w:type="spellEnd"/>
+      <w:r>
+        <w:rPr>
+          <w:rFonts w:ascii="Segoe UI" w:eastAsia="Times New Roman" w:hAnsi="Segoe UI" w:cs="Segoe UI"/>
+          <w:noProof w:val="0"/>
+          <w:color w:val="0D0D0D"/>
+          <w:sz w:val="24"/>
+          <w:szCs w:val="24"/>
+          <w:lang w:val="fr-FR" w:eastAsia="fr-FR"/>
+        </w:rPr>
+        <w:t xml:space="preserve"> physiques en temps réel. Parmi ces architectures, les systèmes SCADA (</w:t>
+      </w:r>
+      <w:r>
+        <w:rPr>
+          <w:rFonts w:ascii="Segoe UI" w:eastAsia="Times New Roman" w:hAnsi="Segoe UI" w:cs="Segoe UI"/>
+          <w:i/>
+          <w:iCs/>
+          <w:noProof w:val="0"/>
+          <w:color w:val="0D0D0D"/>
+          <w:sz w:val="24"/>
+          <w:szCs w:val="24"/>
+          <w:lang w:val="fr-FR" w:eastAsia="fr-FR"/>
+        </w:rPr>
+        <w:t>Supervisory Control And Data Acquisition</w:t>
+      </w:r>
+      <w:r>
+        <w:rPr>
+          <w:rFonts w:ascii="Segoe UI" w:eastAsia="Times New Roman" w:hAnsi="Segoe UI" w:cs="Segoe UI"/>
+          <w:noProof w:val="0"/>
+          <w:color w:val="0D0D0D"/>
+          <w:sz w:val="24"/>
+          <w:szCs w:val="24"/>
+          <w:lang w:val="fr-FR" w:eastAsia="fr-FR"/>
+        </w:rPr>
+        <w:t>) occupent une place centrale dans la gestion des infrastructures critiques, notamment dans les domaines de l’énergie, de l’eau et de l’industrie manufacturière. Ces systèmes assurent l’acquisition des données issues du terrain, leur traitement ainsi que leur visualisation afin de permettre une prise de décision rapide et efficace.</w:t>
+      </w:r>
+    </w:p>
+    <w:p>
+      <w:pPr>
+        <w:shd w:val="clear" w:color="auto" w:fill="FFFFFF"/>
+        <w:spacing w:before="100" w:beforeAutospacing="1" w:after="100" w:afterAutospacing="1" w:line="240" w:lineRule="auto"/>
+        <w:rPr>
+          <w:rFonts w:ascii="Segoe UI" w:eastAsia="Times New Roman" w:hAnsi="Segoe UI" w:cs="Segoe UI"/>
+          <w:noProof w:val="0"/>
+          <w:color w:val="0D0D0D"/>
+          <w:sz w:val="24"/>
+          <w:szCs w:val="24"/>
+          <w:lang w:val="fr-FR" w:eastAsia="fr-FR"/>
+        </w:rPr>
+      </w:pPr>
+      <w:r>
+        <w:rPr>
+          <w:rFonts w:ascii="Segoe UI" w:eastAsia="Times New Roman" w:hAnsi="Segoe UI" w:cs="Segoe UI"/>
+          <w:noProof w:val="0"/>
+          <w:color w:val="0D0D0D"/>
+          <w:sz w:val="24"/>
+          <w:szCs w:val="24"/>
+          <w:lang w:val="fr-FR" w:eastAsia="fr-FR"/>
+        </w:rPr>
+        <w:t>Dans le cadre de ce projet, dont l’objectif principal est le développement d’un système intelligent d’audit de sécurité des environnements industriels, il est nécessaire de disposer d’un cadre expérimental permettant de reproduire fidèlement le comportement d’un système réel. L’utilisation d’une plateforme physique étant coûteuse, complexe et parfois risquée, le choix s’est orienté vers la conception d’un environnement simulé. Cette approche permet non seulement de générer des données industrielles réalistes, mais également de reproduire des scénarios d’attaques sans compromettre un système réel.</w:t>
+      </w:r>
+    </w:p>
+    <w:p>
+      <w:pPr>
+        <w:shd w:val="clear" w:color="auto" w:fill="FFFFFF"/>
+        <w:spacing w:before="100" w:beforeAutospacing="1" w:after="100" w:afterAutospacing="1" w:line="240" w:lineRule="auto"/>
+        <w:rPr>
+          <w:rFonts w:ascii="Segoe UI" w:eastAsia="Times New Roman" w:hAnsi="Segoe UI" w:cs="Segoe UI"/>
+          <w:noProof w:val="0"/>
+          <w:color w:val="0D0D0D"/>
+          <w:sz w:val="24"/>
+          <w:szCs w:val="24"/>
+          <w:lang w:val="fr-FR" w:eastAsia="fr-FR"/>
+        </w:rPr>
+      </w:pPr>
+      <w:r>
+        <w:rPr>
+          <w:rFonts w:ascii="Segoe UI" w:eastAsia="Times New Roman" w:hAnsi="Segoe UI" w:cs="Segoe UI"/>
+          <w:noProof w:val="0"/>
+          <w:color w:val="0D0D0D"/>
+          <w:sz w:val="24"/>
+          <w:szCs w:val="24"/>
+          <w:lang w:val="fr-FR" w:eastAsia="fr-FR"/>
+        </w:rPr>
+        <w:t>Selon le National Institute of Standards and Technology, la simulation constitue une méthode pertinente pour tester la robustesse et la sécurité des systèmes de contrôle industriel dans un environnement contrôlé (NIST, 2015). Ainsi, cette phase représente une étape fondamentale du projet, puisqu’elle fournit les données nécessaires à l’analyse et à la détection des anomalies dans les phases ultérieures.</w:t>
+      </w:r>
+    </w:p>
+    <w:p>
+      <w:pPr>
+        <w:pStyle w:val="Titre2"/>
+        <w:shd w:val="clear" w:color="auto" w:fill="FFFFFF"/>
+        <w:spacing w:before="0" w:beforeAutospacing="0" w:after="0" w:afterAutospacing="0"/>
+        <w:rPr>
+          <w:rFonts w:ascii="Segoe UI" w:hAnsi="Segoe UI" w:cs="Segoe UI"/>
+          <w:color w:val="0D0D0D"/>
+          <w:sz w:val="30"/>
+          <w:szCs w:val="30"/>
+        </w:rPr>
+      </w:pPr>
+      <w:r>
+        <w:rPr>
           <w:sz w:val="32"/>
           <w:szCs w:val="32"/>
-          <w:lang w:val="fr-FR" w:eastAsia="fr-FR"/>
-        </w:rPr>
-      </w:pPr>
-      <w:r>
-        <w:rPr>
-          <w:rFonts w:ascii="Times New Roman" w:eastAsia="Times New Roman" w:hAnsi="Times New Roman" w:cs="Times New Roman"/>
-          <w:b/>
-          <w:bCs/>
-          <w:noProof w:val="0"/>
+        </w:rPr>
+        <w:t>2</w:t>
+      </w:r>
+      <w:r>
+        <w:rPr>
           <w:sz w:val="32"/>
           <w:szCs w:val="32"/>
-          <w:lang w:val="fr-FR" w:eastAsia="fr-FR"/>
-        </w:rPr>
-        <w:t>2</w:t>
-      </w:r>
-      <w:r>
-        <w:rPr>
-          <w:rFonts w:ascii="Times New Roman" w:eastAsia="Times New Roman" w:hAnsi="Times New Roman" w:cs="Times New Roman"/>
-          <w:b/>
-          <w:bCs/>
-          <w:noProof w:val="0"/>
+        </w:rPr>
+        <w:t>.</w:t>
+      </w:r>
+      <w:r>
+        <w:rPr>
           <w:sz w:val="32"/>
           <w:szCs w:val="32"/>
-          <w:lang w:val="fr-FR" w:eastAsia="fr-FR"/>
-        </w:rPr>
-        <w:t>.</w:t>
-      </w:r>
-      <w:r>
-        <w:rPr>
-          <w:rFonts w:ascii="Times New Roman" w:eastAsia="Times New Roman" w:hAnsi="Times New Roman" w:cs="Times New Roman"/>
-          <w:b/>
-          <w:bCs/>
-          <w:noProof w:val="0"/>
+        </w:rPr>
+        <w:t>2</w:t>
+      </w:r>
+      <w:r>
+        <w:rPr>
           <w:sz w:val="32"/>
           <w:szCs w:val="32"/>
-          <w:lang w:val="fr-FR" w:eastAsia="fr-FR"/>
-        </w:rPr>
-        <w:t>2</w:t>
-      </w:r>
-      <w:r>
-        <w:rPr>
-          <w:rFonts w:ascii="Times New Roman" w:eastAsia="Times New Roman" w:hAnsi="Times New Roman" w:cs="Times New Roman"/>
-          <w:b/>
-          <w:bCs/>
-          <w:noProof w:val="0"/>
-          <w:sz w:val="32"/>
-          <w:szCs w:val="32"/>
-          <w:lang w:val="fr-FR" w:eastAsia="fr-FR"/>
         </w:rPr>
         <w:t xml:space="preserve"> </w:t>
       </w:r>
       <w:r>
         <w:rPr>
-          <w:rFonts w:ascii="Times New Roman" w:eastAsia="Times New Roman" w:hAnsi="Times New Roman" w:cs="Times New Roman"/>
-          <w:b/>
-          <w:bCs/>
-          <w:noProof w:val="0"/>
-          <w:sz w:val="32"/>
-          <w:szCs w:val="32"/>
-          <w:lang w:val="fr-FR" w:eastAsia="fr-FR"/>
-        </w:rPr>
-        <w:t>Objectif</w:t>
-      </w:r>
-    </w:p>
-    <w:p>
-      <w:pPr>
-        <w:spacing w:before="100" w:beforeAutospacing="1" w:after="100" w:afterAutospacing="1" w:line="240" w:lineRule="auto"/>
-        <w:rPr>
-          <w:rFonts w:ascii="Times New Roman" w:eastAsia="Times New Roman" w:hAnsi="Times New Roman" w:cs="Times New Roman"/>
-          <w:noProof w:val="0"/>
-          <w:sz w:val="24"/>
-          <w:szCs w:val="24"/>
-          <w:lang w:val="fr-FR" w:eastAsia="fr-FR"/>
-        </w:rPr>
-      </w:pPr>
-      <w:r>
-        <w:rPr>
-          <w:rFonts w:ascii="Times New Roman" w:eastAsia="Times New Roman" w:hAnsi="Times New Roman" w:cs="Times New Roman"/>
-          <w:noProof w:val="0"/>
-          <w:sz w:val="24"/>
-          <w:szCs w:val="24"/>
-          <w:lang w:val="fr-FR" w:eastAsia="fr-FR"/>
-        </w:rPr>
-        <w:t>Le but de cette phase est multiple :</w:t>
-      </w:r>
-    </w:p>
-    <w:p>
-      <w:pPr>
-        <w:numPr>
-          <w:ilvl w:val="0"/>
-          <w:numId w:val="10"/>
-        </w:numPr>
-        <w:spacing w:before="100" w:beforeAutospacing="1" w:after="100" w:afterAutospacing="1" w:line="240" w:lineRule="auto"/>
-        <w:rPr>
-          <w:rFonts w:ascii="Times New Roman" w:eastAsia="Times New Roman" w:hAnsi="Times New Roman" w:cs="Times New Roman"/>
-          <w:noProof w:val="0"/>
-          <w:sz w:val="24"/>
-          <w:szCs w:val="24"/>
-          <w:lang w:val="fr-FR" w:eastAsia="fr-FR"/>
-        </w:rPr>
-      </w:pPr>
-      <w:r>
-        <w:rPr>
-          <w:rFonts w:ascii="Times New Roman" w:eastAsia="Times New Roman" w:hAnsi="Times New Roman" w:cs="Times New Roman"/>
-          <w:b/>
-          <w:bCs/>
-          <w:noProof w:val="0"/>
-          <w:sz w:val="24"/>
-          <w:szCs w:val="24"/>
-          <w:lang w:val="fr-FR" w:eastAsia="fr-FR"/>
-        </w:rPr>
-        <w:t>Créer un PLC simulé</w:t>
-      </w:r>
-      <w:r>
-        <w:rPr>
-          <w:rFonts w:ascii="Times New Roman" w:eastAsia="Times New Roman" w:hAnsi="Times New Roman" w:cs="Times New Roman"/>
-          <w:noProof w:val="0"/>
-          <w:sz w:val="24"/>
-          <w:szCs w:val="24"/>
-          <w:lang w:val="fr-FR" w:eastAsia="fr-FR"/>
-        </w:rPr>
-        <w:t xml:space="preserve"> en utilisant Python et la librairie </w:t>
-      </w:r>
-      <w:proofErr w:type="spellStart"/>
-      <w:r>
-        <w:rPr>
-          <w:rFonts w:ascii="Courier New" w:eastAsia="Times New Roman" w:hAnsi="Courier New" w:cs="Courier New"/>
-          <w:noProof w:val="0"/>
-          <w:sz w:val="20"/>
-          <w:szCs w:val="20"/>
-          <w:lang w:val="fr-FR" w:eastAsia="fr-FR"/>
-        </w:rPr>
-        <w:t>pymodbus</w:t>
-      </w:r>
-      <w:proofErr w:type="spellEnd"/>
-      <w:r>
-        <w:rPr>
-          <w:rFonts w:ascii="Times New Roman" w:eastAsia="Times New Roman" w:hAnsi="Times New Roman" w:cs="Times New Roman"/>
-          <w:noProof w:val="0"/>
-          <w:sz w:val="24"/>
-          <w:szCs w:val="24"/>
-          <w:lang w:val="fr-FR" w:eastAsia="fr-FR"/>
-        </w:rPr>
-        <w:t xml:space="preserve"> qui expose des registres industriels sur un serveur Modbus TCP.</w:t>
-      </w:r>
-    </w:p>
-    <w:p>
-      <w:pPr>
-        <w:numPr>
-          <w:ilvl w:val="0"/>
-          <w:numId w:val="10"/>
-        </w:numPr>
-        <w:spacing w:before="100" w:beforeAutospacing="1" w:after="100" w:afterAutospacing="1" w:line="240" w:lineRule="auto"/>
-        <w:rPr>
-          <w:rFonts w:ascii="Times New Roman" w:eastAsia="Times New Roman" w:hAnsi="Times New Roman" w:cs="Times New Roman"/>
-          <w:noProof w:val="0"/>
-          <w:sz w:val="24"/>
-          <w:szCs w:val="24"/>
-          <w:lang w:val="fr-FR" w:eastAsia="fr-FR"/>
-        </w:rPr>
-      </w:pPr>
-      <w:r>
-        <w:rPr>
-          <w:rFonts w:ascii="Times New Roman" w:eastAsia="Times New Roman" w:hAnsi="Times New Roman" w:cs="Times New Roman"/>
-          <w:b/>
-          <w:bCs/>
-          <w:noProof w:val="0"/>
-          <w:sz w:val="24"/>
-          <w:szCs w:val="24"/>
-          <w:lang w:val="fr-FR" w:eastAsia="fr-FR"/>
-        </w:rPr>
-        <w:t>Définir des variables industrielles</w:t>
-      </w:r>
-      <w:r>
-        <w:rPr>
-          <w:rFonts w:ascii="Times New Roman" w:eastAsia="Times New Roman" w:hAnsi="Times New Roman" w:cs="Times New Roman"/>
-          <w:noProof w:val="0"/>
-          <w:sz w:val="24"/>
-          <w:szCs w:val="24"/>
-          <w:lang w:val="fr-FR" w:eastAsia="fr-FR"/>
-        </w:rPr>
-        <w:t xml:space="preserve"> pour simuler un environnement réaliste.</w:t>
-      </w:r>
-    </w:p>
-    <w:p>
-      <w:pPr>
-        <w:numPr>
-          <w:ilvl w:val="0"/>
-          <w:numId w:val="10"/>
-        </w:numPr>
-        <w:spacing w:before="100" w:beforeAutospacing="1" w:after="100" w:afterAutospacing="1" w:line="240" w:lineRule="auto"/>
-        <w:rPr>
-          <w:rFonts w:ascii="Times New Roman" w:eastAsia="Times New Roman" w:hAnsi="Times New Roman" w:cs="Times New Roman"/>
-          <w:noProof w:val="0"/>
-          <w:sz w:val="24"/>
-          <w:szCs w:val="24"/>
-          <w:lang w:val="fr-FR" w:eastAsia="fr-FR"/>
-        </w:rPr>
-      </w:pPr>
-      <w:r>
-        <w:rPr>
-          <w:rFonts w:ascii="Times New Roman" w:eastAsia="Times New Roman" w:hAnsi="Times New Roman" w:cs="Times New Roman"/>
-          <w:b/>
-          <w:bCs/>
-          <w:noProof w:val="0"/>
-          <w:sz w:val="24"/>
-          <w:szCs w:val="24"/>
-          <w:lang w:val="fr-FR" w:eastAsia="fr-FR"/>
-        </w:rPr>
-        <w:t>Implémenter deux modes</w:t>
-      </w:r>
-      <w:r>
-        <w:rPr>
-          <w:rFonts w:ascii="Times New Roman" w:eastAsia="Times New Roman" w:hAnsi="Times New Roman" w:cs="Times New Roman"/>
-          <w:noProof w:val="0"/>
-          <w:sz w:val="24"/>
-          <w:szCs w:val="24"/>
-          <w:lang w:val="fr-FR" w:eastAsia="fr-FR"/>
-        </w:rPr>
-        <w:t xml:space="preserve"> :</w:t>
-      </w:r>
-    </w:p>
-    <w:p>
-      <w:pPr>
-        <w:numPr>
-          <w:ilvl w:val="1"/>
-          <w:numId w:val="10"/>
-        </w:numPr>
-        <w:spacing w:before="100" w:beforeAutospacing="1" w:after="100" w:afterAutospacing="1" w:line="240" w:lineRule="auto"/>
-        <w:rPr>
-          <w:rFonts w:ascii="Times New Roman" w:eastAsia="Times New Roman" w:hAnsi="Times New Roman" w:cs="Times New Roman"/>
-          <w:noProof w:val="0"/>
-          <w:sz w:val="24"/>
-          <w:szCs w:val="24"/>
-          <w:lang w:val="fr-FR" w:eastAsia="fr-FR"/>
-        </w:rPr>
-      </w:pPr>
-      <w:r>
-        <w:rPr>
-          <w:rFonts w:ascii="Times New Roman" w:eastAsia="Times New Roman" w:hAnsi="Times New Roman" w:cs="Times New Roman"/>
-          <w:b/>
-          <w:bCs/>
-          <w:noProof w:val="0"/>
-          <w:sz w:val="24"/>
-          <w:szCs w:val="24"/>
-          <w:lang w:val="fr-FR" w:eastAsia="fr-FR"/>
-        </w:rPr>
-        <w:t>Mode normal</w:t>
-      </w:r>
-      <w:r>
-        <w:rPr>
-          <w:rFonts w:ascii="Times New Roman" w:eastAsia="Times New Roman" w:hAnsi="Times New Roman" w:cs="Times New Roman"/>
-          <w:noProof w:val="0"/>
-          <w:sz w:val="24"/>
-          <w:szCs w:val="24"/>
-          <w:lang w:val="fr-FR" w:eastAsia="fr-FR"/>
-        </w:rPr>
-        <w:t xml:space="preserve"> : comportement stable et réaliste des variables</w:t>
-      </w:r>
-    </w:p>
-    <w:p>
-      <w:pPr>
-        <w:numPr>
-          <w:ilvl w:val="1"/>
-          <w:numId w:val="10"/>
-        </w:numPr>
-        <w:spacing w:before="100" w:beforeAutospacing="1" w:after="100" w:afterAutospacing="1" w:line="240" w:lineRule="auto"/>
-        <w:rPr>
-          <w:rFonts w:ascii="Times New Roman" w:eastAsia="Times New Roman" w:hAnsi="Times New Roman" w:cs="Times New Roman"/>
-          <w:noProof w:val="0"/>
-          <w:sz w:val="24"/>
-          <w:szCs w:val="24"/>
-          <w:lang w:val="fr-FR" w:eastAsia="fr-FR"/>
-        </w:rPr>
-      </w:pPr>
-      <w:r>
-        <w:rPr>
-          <w:rFonts w:ascii="Times New Roman" w:eastAsia="Times New Roman" w:hAnsi="Times New Roman" w:cs="Times New Roman"/>
-          <w:b/>
-          <w:bCs/>
-          <w:noProof w:val="0"/>
-          <w:sz w:val="24"/>
-          <w:szCs w:val="24"/>
-          <w:lang w:val="fr-FR" w:eastAsia="fr-FR"/>
-        </w:rPr>
-        <w:t>Mode anomalie (malware simulé)</w:t>
-      </w:r>
-      <w:r>
-        <w:rPr>
-          <w:rFonts w:ascii="Times New Roman" w:eastAsia="Times New Roman" w:hAnsi="Times New Roman" w:cs="Times New Roman"/>
-          <w:noProof w:val="0"/>
-          <w:sz w:val="24"/>
-          <w:szCs w:val="24"/>
-          <w:lang w:val="fr-FR" w:eastAsia="fr-FR"/>
-        </w:rPr>
-        <w:t xml:space="preserve"> : valeurs extrêmes et modifications non autorisées</w:t>
-      </w:r>
-    </w:p>
-    <w:p>
-      <w:pPr>
-        <w:numPr>
-          <w:ilvl w:val="0"/>
-          <w:numId w:val="10"/>
-        </w:numPr>
-        <w:spacing w:before="100" w:beforeAutospacing="1" w:after="100" w:afterAutospacing="1" w:line="240" w:lineRule="auto"/>
-        <w:rPr>
-          <w:rFonts w:ascii="Times New Roman" w:eastAsia="Times New Roman" w:hAnsi="Times New Roman" w:cs="Times New Roman"/>
-          <w:noProof w:val="0"/>
-          <w:sz w:val="24"/>
-          <w:szCs w:val="24"/>
-          <w:lang w:val="fr-FR" w:eastAsia="fr-FR"/>
-        </w:rPr>
-      </w:pPr>
-      <w:r>
-        <w:rPr>
-          <w:rFonts w:ascii="Times New Roman" w:eastAsia="Times New Roman" w:hAnsi="Times New Roman" w:cs="Times New Roman"/>
-          <w:b/>
-          <w:bCs/>
-          <w:noProof w:val="0"/>
-          <w:sz w:val="24"/>
-          <w:szCs w:val="24"/>
-          <w:lang w:val="fr-FR" w:eastAsia="fr-FR"/>
-        </w:rPr>
-        <w:t>Tester la communication</w:t>
-      </w:r>
-      <w:r>
-        <w:rPr>
-          <w:rFonts w:ascii="Times New Roman" w:eastAsia="Times New Roman" w:hAnsi="Times New Roman" w:cs="Times New Roman"/>
-          <w:noProof w:val="0"/>
-          <w:sz w:val="24"/>
-          <w:szCs w:val="24"/>
-          <w:lang w:val="fr-FR" w:eastAsia="fr-FR"/>
-        </w:rPr>
-        <w:t xml:space="preserve"> avec un client Modbus (Modbus </w:t>
-      </w:r>
-      <w:proofErr w:type="spellStart"/>
-      <w:r>
-        <w:rPr>
-          <w:rFonts w:ascii="Times New Roman" w:eastAsia="Times New Roman" w:hAnsi="Times New Roman" w:cs="Times New Roman"/>
-          <w:noProof w:val="0"/>
-          <w:sz w:val="24"/>
-          <w:szCs w:val="24"/>
-          <w:lang w:val="fr-FR" w:eastAsia="fr-FR"/>
-        </w:rPr>
-        <w:t>Poll</w:t>
-      </w:r>
-      <w:proofErr w:type="spellEnd"/>
-      <w:r>
-        <w:rPr>
-          <w:rFonts w:ascii="Times New Roman" w:eastAsia="Times New Roman" w:hAnsi="Times New Roman" w:cs="Times New Roman"/>
-          <w:noProof w:val="0"/>
-          <w:sz w:val="24"/>
-          <w:szCs w:val="24"/>
-          <w:lang w:val="fr-FR" w:eastAsia="fr-FR"/>
-        </w:rPr>
-        <w:t>) pour s’assurer que le PLC simulé fonctionne correctement.</w:t>
-      </w:r>
-    </w:p>
-    <w:p>
-      <w:pPr>
-        <w:numPr>
-          <w:ilvl w:val="0"/>
-          <w:numId w:val="10"/>
-        </w:numPr>
-        <w:spacing w:before="100" w:beforeAutospacing="1" w:after="100" w:afterAutospacing="1" w:line="240" w:lineRule="auto"/>
-        <w:rPr>
-          <w:rFonts w:ascii="Times New Roman" w:eastAsia="Times New Roman" w:hAnsi="Times New Roman" w:cs="Times New Roman"/>
-          <w:noProof w:val="0"/>
-          <w:sz w:val="24"/>
-          <w:szCs w:val="24"/>
-          <w:lang w:val="fr-FR" w:eastAsia="fr-FR"/>
-        </w:rPr>
-      </w:pPr>
-      <w:r>
-        <w:rPr>
-          <w:rFonts w:ascii="Times New Roman" w:eastAsia="Times New Roman" w:hAnsi="Times New Roman" w:cs="Times New Roman"/>
-          <w:b/>
-          <w:bCs/>
-          <w:noProof w:val="0"/>
-          <w:sz w:val="24"/>
-          <w:szCs w:val="24"/>
-          <w:lang w:val="fr-FR" w:eastAsia="fr-FR"/>
-        </w:rPr>
-        <w:t>Générer des logs</w:t>
-      </w:r>
-      <w:r>
-        <w:rPr>
-          <w:rFonts w:ascii="Times New Roman" w:eastAsia="Times New Roman" w:hAnsi="Times New Roman" w:cs="Times New Roman"/>
-          <w:noProof w:val="0"/>
-          <w:sz w:val="24"/>
-          <w:szCs w:val="24"/>
-          <w:lang w:val="fr-FR" w:eastAsia="fr-FR"/>
-        </w:rPr>
-        <w:t xml:space="preserve"> qui serviront à la phase 2 pour développer les algorithmes de détection.</w:t>
-      </w:r>
-    </w:p>
-    <w:p>
-      <w:pPr>
-        <w:spacing w:before="100" w:beforeAutospacing="1" w:after="100" w:afterAutospacing="1" w:line="240" w:lineRule="auto"/>
-        <w:rPr>
-          <w:rFonts w:ascii="Times New Roman" w:eastAsia="Times New Roman" w:hAnsi="Times New Roman" w:cs="Times New Roman"/>
-          <w:noProof w:val="0"/>
-          <w:sz w:val="24"/>
-          <w:szCs w:val="24"/>
-          <w:lang w:val="fr-FR" w:eastAsia="fr-FR"/>
-        </w:rPr>
-      </w:pPr>
-    </w:p>
-    <w:p>
-      <w:pPr>
-        <w:spacing w:before="100" w:beforeAutospacing="1" w:after="100" w:afterAutospacing="1" w:line="240" w:lineRule="auto"/>
-        <w:rPr>
-          <w:rFonts w:ascii="Times New Roman" w:eastAsia="Times New Roman" w:hAnsi="Times New Roman" w:cs="Times New Roman"/>
-          <w:noProof w:val="0"/>
-          <w:sz w:val="24"/>
-          <w:szCs w:val="24"/>
-          <w:lang w:val="fr-FR" w:eastAsia="fr-FR"/>
-        </w:rPr>
-      </w:pPr>
-    </w:p>
-    <w:p>
-      <w:pPr>
-        <w:spacing w:before="100" w:beforeAutospacing="1" w:after="100" w:afterAutospacing="1" w:line="240" w:lineRule="auto"/>
-        <w:rPr>
-          <w:rFonts w:ascii="Times New Roman" w:eastAsia="Times New Roman" w:hAnsi="Times New Roman" w:cs="Times New Roman"/>
-          <w:noProof w:val="0"/>
-          <w:sz w:val="24"/>
-          <w:szCs w:val="24"/>
-          <w:lang w:val="fr-FR" w:eastAsia="fr-FR"/>
-        </w:rPr>
-      </w:pPr>
-    </w:p>
-    <w:p>
-      <w:pPr>
-        <w:spacing w:before="100" w:beforeAutospacing="1" w:after="100" w:afterAutospacing="1" w:line="240" w:lineRule="auto"/>
-        <w:rPr>
-          <w:rFonts w:ascii="Times New Roman" w:eastAsia="Times New Roman" w:hAnsi="Times New Roman" w:cs="Times New Roman"/>
-          <w:noProof w:val="0"/>
-          <w:sz w:val="24"/>
-          <w:szCs w:val="24"/>
-          <w:lang w:val="fr-FR" w:eastAsia="fr-FR"/>
-        </w:rPr>
-      </w:pPr>
-    </w:p>
-    <w:p>
-      <w:pPr>
-        <w:spacing w:before="100" w:beforeAutospacing="1" w:after="100" w:afterAutospacing="1" w:line="240" w:lineRule="auto"/>
-        <w:rPr>
-          <w:rFonts w:ascii="Times New Roman" w:eastAsia="Times New Roman" w:hAnsi="Times New Roman" w:cs="Times New Roman"/>
-          <w:noProof w:val="0"/>
-          <w:sz w:val="24"/>
-          <w:szCs w:val="24"/>
-          <w:lang w:val="fr-FR" w:eastAsia="fr-FR"/>
-        </w:rPr>
-      </w:pPr>
+          <w:rStyle w:val="lev"/>
+          <w:rFonts w:ascii="Segoe UI" w:hAnsi="Segoe UI" w:cs="Segoe UI"/>
+          <w:b/>
+          <w:bCs/>
+          <w:color w:val="0D0D0D"/>
+          <w:sz w:val="30"/>
+          <w:szCs w:val="30"/>
+        </w:rPr>
+        <w:t>Objectifs de la phase</w:t>
+      </w:r>
+    </w:p>
+    <w:p>
+      <w:pPr>
+        <w:shd w:val="clear" w:color="auto" w:fill="FFFFFF"/>
+        <w:spacing w:before="100" w:beforeAutospacing="1" w:after="100" w:afterAutospacing="1" w:line="240" w:lineRule="auto"/>
+        <w:rPr>
+          <w:rFonts w:ascii="Segoe UI" w:eastAsia="Times New Roman" w:hAnsi="Segoe UI" w:cs="Segoe UI"/>
+          <w:noProof w:val="0"/>
+          <w:color w:val="0D0D0D"/>
+          <w:sz w:val="24"/>
+          <w:szCs w:val="24"/>
+          <w:lang w:val="fr-FR" w:eastAsia="fr-FR"/>
+        </w:rPr>
+      </w:pPr>
+      <w:r>
+        <w:rPr>
+          <w:rFonts w:ascii="Segoe UI" w:eastAsia="Times New Roman" w:hAnsi="Segoe UI" w:cs="Segoe UI"/>
+          <w:noProof w:val="0"/>
+          <w:color w:val="0D0D0D"/>
+          <w:sz w:val="24"/>
+          <w:szCs w:val="24"/>
+          <w:lang w:val="fr-FR" w:eastAsia="fr-FR"/>
+        </w:rPr>
+        <w:t>L’objectif de cette phase consiste à concevoir et implémenter un environnement SCADA simulé capable de reproduire le comportement d’un système industriel réel. Plus précisément, il s’agit de développer un automate programmable virtuel capable de générer des variables industrielles représentatives, de les exposer via un protocole de communication standard et de produire des données exploitables pour l’analyse.</w:t>
+      </w:r>
+    </w:p>
+    <w:p>
+      <w:pPr>
+        <w:shd w:val="clear" w:color="auto" w:fill="FFFFFF"/>
+        <w:spacing w:before="100" w:beforeAutospacing="1" w:after="100" w:afterAutospacing="1" w:line="240" w:lineRule="auto"/>
+        <w:rPr>
+          <w:rFonts w:ascii="Segoe UI" w:eastAsia="Times New Roman" w:hAnsi="Segoe UI" w:cs="Segoe UI"/>
+          <w:noProof w:val="0"/>
+          <w:color w:val="0D0D0D"/>
+          <w:sz w:val="24"/>
+          <w:szCs w:val="24"/>
+          <w:lang w:val="fr-FR" w:eastAsia="fr-FR"/>
+        </w:rPr>
+      </w:pPr>
+      <w:r>
+        <w:rPr>
+          <w:rFonts w:ascii="Segoe UI" w:eastAsia="Times New Roman" w:hAnsi="Segoe UI" w:cs="Segoe UI"/>
+          <w:noProof w:val="0"/>
+          <w:color w:val="0D0D0D"/>
+          <w:sz w:val="24"/>
+          <w:szCs w:val="24"/>
+          <w:lang w:val="fr-FR" w:eastAsia="fr-FR"/>
+        </w:rPr>
+        <w:t>Dans cette optique, un serveur Modbus TCP est mis en place afin de simuler la communication entre un PLC et un système de supervision. Le système doit être capable de fonctionner selon deux modes distincts, à savoir un mode normal reproduisant un comportement stable et réaliste, et un mode anormal simulant des comportements malveillants. Cette dualité permet de générer un ensemble de données variées, essentielles pour l’apprentissage et l’évaluation des mécanismes de détection d’anomalies.</w:t>
+      </w:r>
     </w:p>
     <w:p>
       <w:pPr>
@@ -4418,6 +3869,148 @@
     </w:p>
     <w:p>
       <w:pPr>
+        <w:pStyle w:val="Titre2"/>
+        <w:shd w:val="clear" w:color="auto" w:fill="FFFFFF"/>
+        <w:spacing w:before="0" w:beforeAutospacing="0" w:after="0" w:afterAutospacing="0"/>
+        <w:rPr>
+          <w:color w:val="0070C0"/>
+          <w:sz w:val="24"/>
+          <w:szCs w:val="24"/>
+        </w:rPr>
+      </w:pPr>
+      <w:r>
+        <w:rPr>
+          <w:color w:val="0070C0"/>
+          <w:sz w:val="24"/>
+          <w:szCs w:val="24"/>
+        </w:rPr>
+        <w:t xml:space="preserve">Description de </w:t>
+      </w:r>
+      <w:r>
+        <w:rPr>
+          <w:color w:val="0070C0"/>
+          <w:sz w:val="24"/>
+          <w:szCs w:val="24"/>
+        </w:rPr>
+        <w:t>Architecture du système</w:t>
+      </w:r>
+    </w:p>
+    <w:p>
+      <w:pPr>
+        <w:shd w:val="clear" w:color="auto" w:fill="FFFFFF"/>
+        <w:spacing w:before="100" w:beforeAutospacing="1" w:after="100" w:afterAutospacing="1" w:line="240" w:lineRule="auto"/>
+        <w:rPr>
+          <w:rFonts w:ascii="Segoe UI" w:eastAsia="Times New Roman" w:hAnsi="Segoe UI" w:cs="Segoe UI"/>
+          <w:noProof w:val="0"/>
+          <w:color w:val="0D0D0D"/>
+          <w:sz w:val="24"/>
+          <w:szCs w:val="24"/>
+          <w:lang w:val="fr-FR" w:eastAsia="fr-FR"/>
+        </w:rPr>
+      </w:pPr>
+      <w:r>
+        <w:rPr>
+          <w:rFonts w:ascii="Segoe UI" w:eastAsia="Times New Roman" w:hAnsi="Segoe UI" w:cs="Segoe UI"/>
+          <w:noProof w:val="0"/>
+          <w:color w:val="0D0D0D"/>
+          <w:sz w:val="24"/>
+          <w:szCs w:val="24"/>
+          <w:lang w:val="fr-FR" w:eastAsia="fr-FR"/>
+        </w:rPr>
+        <w:t>L’architecture proposée repose sur une structure simple mais représentative d’un système industriel réel. Le cœur du système est constitué d’un PLC simulé développé en Python, chargé de générer les variables industrielles et de les exposer via un serveur Modbus TCP. Ce serveur agit comme une interface de communication permettant aux clients externes d’accéder aux données.</w:t>
+      </w:r>
+    </w:p>
+    <w:p>
+      <w:pPr>
+        <w:shd w:val="clear" w:color="auto" w:fill="FFFFFF"/>
+        <w:spacing w:before="100" w:beforeAutospacing="1" w:after="100" w:afterAutospacing="1" w:line="240" w:lineRule="auto"/>
+        <w:rPr>
+          <w:rFonts w:ascii="Segoe UI" w:eastAsia="Times New Roman" w:hAnsi="Segoe UI" w:cs="Segoe UI"/>
+          <w:noProof w:val="0"/>
+          <w:color w:val="0D0D0D"/>
+          <w:sz w:val="24"/>
+          <w:szCs w:val="24"/>
+          <w:lang w:val="fr-FR" w:eastAsia="fr-FR"/>
+        </w:rPr>
+      </w:pPr>
+      <w:r>
+        <w:rPr>
+          <w:rFonts w:ascii="Segoe UI" w:eastAsia="Times New Roman" w:hAnsi="Segoe UI" w:cs="Segoe UI"/>
+          <w:noProof w:val="0"/>
+          <w:color w:val="0D0D0D"/>
+          <w:sz w:val="24"/>
+          <w:szCs w:val="24"/>
+          <w:lang w:val="fr-FR" w:eastAsia="fr-FR"/>
+        </w:rPr>
+        <w:t xml:space="preserve">Un client Modbus, tel que Modbus </w:t>
+      </w:r>
+      <w:proofErr w:type="spellStart"/>
+      <w:r>
+        <w:rPr>
+          <w:rFonts w:ascii="Segoe UI" w:eastAsia="Times New Roman" w:hAnsi="Segoe UI" w:cs="Segoe UI"/>
+          <w:noProof w:val="0"/>
+          <w:color w:val="0D0D0D"/>
+          <w:sz w:val="24"/>
+          <w:szCs w:val="24"/>
+          <w:lang w:val="fr-FR" w:eastAsia="fr-FR"/>
+        </w:rPr>
+        <w:t>Poll</w:t>
+      </w:r>
+      <w:proofErr w:type="spellEnd"/>
+      <w:r>
+        <w:rPr>
+          <w:rFonts w:ascii="Segoe UI" w:eastAsia="Times New Roman" w:hAnsi="Segoe UI" w:cs="Segoe UI"/>
+          <w:noProof w:val="0"/>
+          <w:color w:val="0D0D0D"/>
+          <w:sz w:val="24"/>
+          <w:szCs w:val="24"/>
+          <w:lang w:val="fr-FR" w:eastAsia="fr-FR"/>
+        </w:rPr>
+        <w:t>, est utilisé afin de tester et de valider le bon fonctionnement du système. Ce client envoie des requêtes au serveur et permet de visualiser les valeurs des registres en temps réel. Cette interaction reproduit le fonctionnement classique d’un système SCADA dans lequel un système de supervision interroge un PLC.</w:t>
+      </w:r>
+    </w:p>
+    <w:p>
+      <w:pPr>
+        <w:shd w:val="clear" w:color="auto" w:fill="FFFFFF"/>
+        <w:spacing w:before="100" w:beforeAutospacing="1" w:after="100" w:afterAutospacing="1" w:line="240" w:lineRule="auto"/>
+        <w:rPr>
+          <w:rFonts w:ascii="Segoe UI" w:eastAsia="Times New Roman" w:hAnsi="Segoe UI" w:cs="Segoe UI"/>
+          <w:noProof w:val="0"/>
+          <w:color w:val="0D0D0D"/>
+          <w:sz w:val="24"/>
+          <w:szCs w:val="24"/>
+          <w:lang w:val="fr-FR" w:eastAsia="fr-FR"/>
+        </w:rPr>
+      </w:pPr>
+      <w:r>
+        <w:rPr>
+          <w:rFonts w:ascii="Segoe UI" w:eastAsia="Times New Roman" w:hAnsi="Segoe UI" w:cs="Segoe UI"/>
+          <w:noProof w:val="0"/>
+          <w:color w:val="0D0D0D"/>
+          <w:sz w:val="24"/>
+          <w:szCs w:val="24"/>
+          <w:lang w:val="fr-FR" w:eastAsia="fr-FR"/>
+        </w:rPr>
+        <w:t>L’ensemble du système est complété par un mécanisme de journalisation permettant d’enregistrer les données générées ainsi que les événements survenant durant l’exécution. Ces logs constituent une source essentielle d’information pour l’analyse des comportements normaux et anormaux.</w:t>
+      </w:r>
+    </w:p>
+    <w:p>
+      <w:pPr>
+        <w:spacing w:after="0" w:line="360" w:lineRule="auto"/>
+        <w:outlineLvl w:val="1"/>
+        <w:rPr>
+          <w:rFonts w:ascii="Times New Roman" w:eastAsia="Times New Roman" w:hAnsi="Times New Roman" w:cs="Times New Roman"/>
+          <w:b/>
+          <w:bCs/>
+          <w:noProof w:val="0"/>
+          <w:sz w:val="32"/>
+          <w:szCs w:val="32"/>
+          <w:lang w:val="fr-FR" w:eastAsia="fr-FR"/>
+        </w:rPr>
+      </w:pPr>
+    </w:p>
+    <w:p>
+      <w:pPr>
         <w:pStyle w:val="Titre3"/>
         <w:spacing w:before="0" w:beforeAutospacing="0" w:after="0" w:afterAutospacing="0" w:line="360" w:lineRule="auto"/>
         <w:rPr>
@@ -4459,6 +4052,7 @@
     </w:p>
     <w:p>
       <w:pPr>
+        <w:shd w:val="clear" w:color="auto" w:fill="F9F9F9"/>
         <w:tabs>
           <w:tab w:val="left" w:pos="916"/>
           <w:tab w:val="left" w:pos="1832"/>
@@ -4477,68 +4071,111 @@
           <w:tab w:val="left" w:pos="13740"/>
           <w:tab w:val="left" w:pos="14656"/>
         </w:tabs>
-        <w:spacing w:after="0" w:line="240" w:lineRule="auto"/>
+        <w:spacing w:after="60" w:line="300" w:lineRule="atLeast"/>
         <w:rPr>
           <w:rFonts w:ascii="Courier New" w:eastAsia="Times New Roman" w:hAnsi="Courier New" w:cs="Courier New"/>
           <w:noProof w:val="0"/>
-          <w:sz w:val="20"/>
-          <w:szCs w:val="20"/>
-          <w:lang w:val="fr-FR" w:eastAsia="fr-FR"/>
-        </w:rPr>
-      </w:pPr>
+          <w:color w:val="0D0D0D"/>
+          <w:sz w:val="21"/>
+          <w:szCs w:val="21"/>
+          <w:lang w:val="fr-FR" w:eastAsia="fr-FR"/>
+        </w:rPr>
+      </w:pPr>
+      <w:proofErr w:type="gramStart"/>
       <w:r>
         <w:rPr>
           <w:rFonts w:ascii="Courier New" w:eastAsia="Times New Roman" w:hAnsi="Courier New" w:cs="Courier New"/>
           <w:noProof w:val="0"/>
-          <w:sz w:val="20"/>
-          <w:szCs w:val="20"/>
-          <w:lang w:val="fr-FR" w:eastAsia="fr-FR"/>
-        </w:rPr>
-        <w:t xml:space="preserve">Variables industrielles → PLC simulé (Python + </w:t>
-      </w:r>
-      <w:proofErr w:type="spellStart"/>
+          <w:color w:val="0D0D0D"/>
+          <w:sz w:val="21"/>
+          <w:szCs w:val="21"/>
+          <w:lang w:val="fr-FR" w:eastAsia="fr-FR"/>
+        </w:rPr>
+        <w:t>[ Vue.js</w:t>
+      </w:r>
+      <w:proofErr w:type="gramEnd"/>
       <w:r>
         <w:rPr>
           <w:rFonts w:ascii="Courier New" w:eastAsia="Times New Roman" w:hAnsi="Courier New" w:cs="Courier New"/>
           <w:noProof w:val="0"/>
-          <w:sz w:val="20"/>
-          <w:szCs w:val="20"/>
-          <w:lang w:val="fr-FR" w:eastAsia="fr-FR"/>
-        </w:rPr>
-        <w:t>pymodbus</w:t>
-      </w:r>
-      <w:proofErr w:type="spellEnd"/>
+          <w:color w:val="0D0D0D"/>
+          <w:sz w:val="21"/>
+          <w:szCs w:val="21"/>
+          <w:lang w:val="fr-FR" w:eastAsia="fr-FR"/>
+        </w:rPr>
+        <w:t xml:space="preserve"> + Electron ]  → Interface SCADA (HMI)</w:t>
+      </w:r>
       <w:r>
         <w:rPr>
           <w:rFonts w:ascii="Courier New" w:eastAsia="Times New Roman" w:hAnsi="Courier New" w:cs="Courier New"/>
           <w:noProof w:val="0"/>
-          <w:sz w:val="20"/>
-          <w:szCs w:val="20"/>
-          <w:lang w:val="fr-FR" w:eastAsia="fr-FR"/>
-        </w:rPr>
-        <w:t xml:space="preserve">) → Modbus TCP (serveur) → Modbus </w:t>
-      </w:r>
-      <w:proofErr w:type="spellStart"/>
+          <w:color w:val="0D0D0D"/>
+          <w:sz w:val="21"/>
+          <w:szCs w:val="21"/>
+          <w:lang w:val="fr-FR" w:eastAsia="fr-FR"/>
+        </w:rPr>
+        <w:br/>
+        <w:t xml:space="preserve">            ↓</w:t>
+      </w:r>
       <w:r>
         <w:rPr>
           <w:rFonts w:ascii="Courier New" w:eastAsia="Times New Roman" w:hAnsi="Courier New" w:cs="Courier New"/>
           <w:noProof w:val="0"/>
-          <w:sz w:val="20"/>
-          <w:szCs w:val="20"/>
-          <w:lang w:val="fr-FR" w:eastAsia="fr-FR"/>
-        </w:rPr>
-        <w:t>Poll</w:t>
-      </w:r>
-      <w:proofErr w:type="spellEnd"/>
+          <w:color w:val="0D0D0D"/>
+          <w:sz w:val="21"/>
+          <w:szCs w:val="21"/>
+          <w:lang w:val="fr-FR" w:eastAsia="fr-FR"/>
+        </w:rPr>
+        <w:br/>
+        <w:t>[ Node.js Server ]     → API + logique + logs</w:t>
+      </w:r>
       <w:r>
         <w:rPr>
           <w:rFonts w:ascii="Courier New" w:eastAsia="Times New Roman" w:hAnsi="Courier New" w:cs="Courier New"/>
           <w:noProof w:val="0"/>
-          <w:sz w:val="20"/>
-          <w:szCs w:val="20"/>
-          <w:lang w:val="fr-FR" w:eastAsia="fr-FR"/>
-        </w:rPr>
-        <w:t xml:space="preserve"> (client) → Logs</w:t>
+          <w:color w:val="0D0D0D"/>
+          <w:sz w:val="21"/>
+          <w:szCs w:val="21"/>
+          <w:lang w:val="fr-FR" w:eastAsia="fr-FR"/>
+        </w:rPr>
+        <w:br/>
+        <w:t xml:space="preserve">            ↓</w:t>
+      </w:r>
+      <w:r>
+        <w:rPr>
+          <w:rFonts w:ascii="Courier New" w:eastAsia="Times New Roman" w:hAnsi="Courier New" w:cs="Courier New"/>
+          <w:noProof w:val="0"/>
+          <w:color w:val="0D0D0D"/>
+          <w:sz w:val="21"/>
+          <w:szCs w:val="21"/>
+          <w:lang w:val="fr-FR" w:eastAsia="fr-FR"/>
+        </w:rPr>
+        <w:br/>
+        <w:t>[ Python PLC ]         → Simulation industrielle (Modbus TCP)</w:t>
+      </w:r>
+      <w:r>
+        <w:rPr>
+          <w:rFonts w:ascii="Courier New" w:eastAsia="Times New Roman" w:hAnsi="Courier New" w:cs="Courier New"/>
+          <w:noProof w:val="0"/>
+          <w:color w:val="0D0D0D"/>
+          <w:sz w:val="21"/>
+          <w:szCs w:val="21"/>
+          <w:lang w:val="fr-FR" w:eastAsia="fr-FR"/>
+        </w:rPr>
+        <w:br/>
+        <w:t xml:space="preserve">            ↓</w:t>
+      </w:r>
+      <w:r>
+        <w:rPr>
+          <w:rFonts w:ascii="Courier New" w:eastAsia="Times New Roman" w:hAnsi="Courier New" w:cs="Courier New"/>
+          <w:noProof w:val="0"/>
+          <w:color w:val="0D0D0D"/>
+          <w:sz w:val="21"/>
+          <w:szCs w:val="21"/>
+          <w:lang w:val="fr-FR" w:eastAsia="fr-FR"/>
+        </w:rPr>
+        <w:br/>
+        <w:t>[ Modbus TCP ]         → Communication industrielle</w:t>
       </w:r>
     </w:p>
     <w:p>
@@ -4778,7 +4415,7 @@
           <w:szCs w:val="24"/>
           <w:lang w:val="fr-FR" w:eastAsia="fr-FR"/>
         </w:rPr>
-        <w:t xml:space="preserve"> Permettent d’analyser les anomalies et préparer la phase 2</w:t>
+        <w:t xml:space="preserve"> Permettent d’analyser les anomalies et préparer la phase</w:t>
       </w:r>
     </w:p>
     <w:p>
@@ -4802,12 +4439,24 @@
           <w:szCs w:val="24"/>
         </w:rPr>
       </w:pPr>
-      <w:r>
+    </w:p>
+    <w:p>
+      <w:pPr>
+        <w:pStyle w:val="Titre3"/>
+        <w:spacing w:before="0" w:beforeAutospacing="0" w:after="0" w:afterAutospacing="0" w:line="360" w:lineRule="auto"/>
         <w:rPr>
           <w:color w:val="0070C0"/>
           <w:sz w:val="24"/>
           <w:szCs w:val="24"/>
         </w:rPr>
+      </w:pPr>
+      <w:r>
+        <w:rPr>
+          <w:color w:val="0070C0"/>
+          <w:sz w:val="24"/>
+          <w:szCs w:val="24"/>
+        </w:rPr>
+        <w:lastRenderedPageBreak/>
         <w:t>Composants</w:t>
       </w:r>
     </w:p>
@@ -5250,6 +4899,109 @@
     </w:p>
     <w:p>
       <w:pPr>
+        <w:pStyle w:val="Titre2"/>
+        <w:shd w:val="clear" w:color="auto" w:fill="FFFFFF"/>
+        <w:spacing w:before="0" w:beforeAutospacing="0" w:after="0" w:afterAutospacing="0"/>
+        <w:rPr>
+          <w:rFonts w:ascii="Segoe UI" w:hAnsi="Segoe UI" w:cs="Segoe UI"/>
+          <w:color w:val="0D0D0D"/>
+          <w:sz w:val="30"/>
+          <w:szCs w:val="30"/>
+        </w:rPr>
+      </w:pPr>
+      <w:r>
+        <w:rPr>
+          <w:sz w:val="32"/>
+          <w:szCs w:val="32"/>
+        </w:rPr>
+        <w:t>2</w:t>
+      </w:r>
+      <w:r>
+        <w:rPr>
+          <w:sz w:val="32"/>
+          <w:szCs w:val="32"/>
+        </w:rPr>
+        <w:t>.</w:t>
+      </w:r>
+      <w:r>
+        <w:rPr>
+          <w:sz w:val="32"/>
+          <w:szCs w:val="32"/>
+        </w:rPr>
+        <w:t>5</w:t>
+      </w:r>
+      <w:r>
+        <w:rPr>
+          <w:sz w:val="32"/>
+          <w:szCs w:val="32"/>
+        </w:rPr>
+        <w:t xml:space="preserve"> </w:t>
+      </w:r>
+      <w:r>
+        <w:rPr>
+          <w:rStyle w:val="lev"/>
+          <w:rFonts w:ascii="Segoe UI" w:hAnsi="Segoe UI" w:cs="Segoe UI"/>
+          <w:b/>
+          <w:bCs/>
+          <w:color w:val="0D0D0D"/>
+          <w:sz w:val="30"/>
+          <w:szCs w:val="30"/>
+        </w:rPr>
+        <w:t>Scénarios de simulation</w:t>
+      </w:r>
+    </w:p>
+    <w:p>
+      <w:pPr>
+        <w:shd w:val="clear" w:color="auto" w:fill="FFFFFF"/>
+        <w:spacing w:before="100" w:beforeAutospacing="1" w:after="100" w:afterAutospacing="1" w:line="240" w:lineRule="auto"/>
+        <w:rPr>
+          <w:rFonts w:ascii="Segoe UI" w:eastAsia="Times New Roman" w:hAnsi="Segoe UI" w:cs="Segoe UI"/>
+          <w:noProof w:val="0"/>
+          <w:color w:val="0D0D0D"/>
+          <w:sz w:val="24"/>
+          <w:szCs w:val="24"/>
+          <w:lang w:val="fr-FR" w:eastAsia="fr-FR"/>
+        </w:rPr>
+      </w:pPr>
+      <w:r>
+        <w:rPr>
+          <w:rFonts w:ascii="Segoe UI" w:eastAsia="Times New Roman" w:hAnsi="Segoe UI" w:cs="Segoe UI"/>
+          <w:noProof w:val="0"/>
+          <w:color w:val="0D0D0D"/>
+          <w:sz w:val="24"/>
+          <w:szCs w:val="24"/>
+          <w:lang w:val="fr-FR" w:eastAsia="fr-FR"/>
+        </w:rPr>
+        <w:t>Afin de reproduire un environnement réaliste, deux modes de fonctionnement ont été implémentés. Le premier correspond à un fonctionnement normal du système, caractérisé par des variations progressives et cohérentes des variables industrielles. Ce mode permet de simuler un comportement stable conforme aux conditions réelles d’exploitation.</w:t>
+      </w:r>
+    </w:p>
+    <w:p>
+      <w:pPr>
+        <w:shd w:val="clear" w:color="auto" w:fill="FFFFFF"/>
+        <w:spacing w:before="100" w:beforeAutospacing="1" w:after="100" w:afterAutospacing="1" w:line="240" w:lineRule="auto"/>
+        <w:rPr>
+          <w:rFonts w:ascii="Segoe UI" w:eastAsia="Times New Roman" w:hAnsi="Segoe UI" w:cs="Segoe UI"/>
+          <w:noProof w:val="0"/>
+          <w:color w:val="0D0D0D"/>
+          <w:sz w:val="24"/>
+          <w:szCs w:val="24"/>
+          <w:lang w:val="fr-FR" w:eastAsia="fr-FR"/>
+        </w:rPr>
+      </w:pPr>
+      <w:r>
+        <w:rPr>
+          <w:rFonts w:ascii="Segoe UI" w:eastAsia="Times New Roman" w:hAnsi="Segoe UI" w:cs="Segoe UI"/>
+          <w:noProof w:val="0"/>
+          <w:color w:val="0D0D0D"/>
+          <w:sz w:val="24"/>
+          <w:szCs w:val="24"/>
+          <w:lang w:val="fr-FR" w:eastAsia="fr-FR"/>
+        </w:rPr>
+        <w:t>Le second mode introduit des comportements anormaux inspirés des attaques industrielles. Dans ce cas, les variables peuvent présenter des valeurs extrêmes ou des variations brusques, reflétant des manipulations malveillantes ou des dysfonctionnements. Ce mode permet de générer des données représentatives de situations critiques, nécessaires pour tester les mécanismes de détection.</w:t>
+      </w:r>
+    </w:p>
+    <w:p>
+      <w:pPr>
         <w:spacing w:after="0" w:line="360" w:lineRule="auto"/>
         <w:outlineLvl w:val="1"/>
         <w:rPr>
@@ -5262,7 +5014,11 @@
           <w:lang w:val="fr-FR" w:eastAsia="fr-FR"/>
         </w:rPr>
       </w:pPr>
-      <w:r>
+    </w:p>
+    <w:p>
+      <w:pPr>
+        <w:spacing w:after="0" w:line="360" w:lineRule="auto"/>
+        <w:outlineLvl w:val="1"/>
         <w:rPr>
           <w:rFonts w:ascii="Times New Roman" w:eastAsia="Times New Roman" w:hAnsi="Times New Roman" w:cs="Times New Roman"/>
           <w:b/>
@@ -5272,8 +5028,7 @@
           <w:szCs w:val="32"/>
           <w:lang w:val="fr-FR" w:eastAsia="fr-FR"/>
         </w:rPr>
-        <w:t>2</w:t>
-      </w:r>
+      </w:pPr>
       <w:r>
         <w:rPr>
           <w:rFonts w:ascii="Times New Roman" w:eastAsia="Times New Roman" w:hAnsi="Times New Roman" w:cs="Times New Roman"/>
@@ -5284,7 +5039,7 @@
           <w:szCs w:val="32"/>
           <w:lang w:val="fr-FR" w:eastAsia="fr-FR"/>
         </w:rPr>
-        <w:t>.</w:t>
+        <w:t>2</w:t>
       </w:r>
       <w:r>
         <w:rPr>
@@ -5296,7 +5051,7 @@
           <w:szCs w:val="32"/>
           <w:lang w:val="fr-FR" w:eastAsia="fr-FR"/>
         </w:rPr>
-        <w:t>5</w:t>
+        <w:t>.</w:t>
       </w:r>
       <w:r>
         <w:rPr>
@@ -5308,7 +5063,7 @@
           <w:szCs w:val="32"/>
           <w:lang w:val="fr-FR" w:eastAsia="fr-FR"/>
         </w:rPr>
-        <w:t xml:space="preserve"> </w:t>
+        <w:t>5</w:t>
       </w:r>
       <w:r>
         <w:rPr>
@@ -5320,6 +5075,18 @@
           <w:szCs w:val="32"/>
           <w:lang w:val="fr-FR" w:eastAsia="fr-FR"/>
         </w:rPr>
+        <w:t xml:space="preserve"> </w:t>
+      </w:r>
+      <w:r>
+        <w:rPr>
+          <w:rFonts w:ascii="Times New Roman" w:eastAsia="Times New Roman" w:hAnsi="Times New Roman" w:cs="Times New Roman"/>
+          <w:b/>
+          <w:bCs/>
+          <w:noProof w:val="0"/>
+          <w:sz w:val="32"/>
+          <w:szCs w:val="32"/>
+          <w:lang w:val="fr-FR" w:eastAsia="fr-FR"/>
+        </w:rPr>
         <w:t>Implémentation du PLC simulé (Python)</w:t>
       </w:r>
     </w:p>
@@ -5339,27 +5106,451 @@
           <w:sz w:val="24"/>
           <w:szCs w:val="24"/>
         </w:rPr>
-        <w:t>Installation</w:t>
-      </w:r>
-    </w:p>
-    <w:p>
-      <w:pPr>
-        <w:pStyle w:val="Titre3"/>
-        <w:spacing w:before="0" w:beforeAutospacing="0" w:after="0" w:afterAutospacing="0" w:line="360" w:lineRule="auto"/>
-        <w:rPr>
-          <w:color w:val="0070C0"/>
-          <w:sz w:val="24"/>
-          <w:szCs w:val="24"/>
-        </w:rPr>
-      </w:pPr>
-      <w:r>
-        <w:rPr>
-          <w:color w:val="0070C0"/>
-          <w:sz w:val="24"/>
-          <w:szCs w:val="24"/>
-        </w:rPr>
-        <w:t>Code du PLC simulé</w:t>
-      </w:r>
+        <w:t>Description</w:t>
+      </w:r>
+    </w:p>
+    <w:p>
+      <w:pPr>
+        <w:shd w:val="clear" w:color="auto" w:fill="FFFFFF"/>
+        <w:spacing w:before="100" w:beforeAutospacing="1" w:after="100" w:afterAutospacing="1" w:line="240" w:lineRule="auto"/>
+        <w:rPr>
+          <w:rFonts w:ascii="Segoe UI" w:eastAsia="Times New Roman" w:hAnsi="Segoe UI" w:cs="Segoe UI"/>
+          <w:noProof w:val="0"/>
+          <w:color w:val="0D0D0D"/>
+          <w:sz w:val="24"/>
+          <w:szCs w:val="24"/>
+          <w:lang w:val="fr-FR" w:eastAsia="fr-FR"/>
+        </w:rPr>
+      </w:pPr>
+      <w:r>
+        <w:rPr>
+          <w:rFonts w:ascii="Segoe UI" w:eastAsia="Times New Roman" w:hAnsi="Segoe UI" w:cs="Segoe UI"/>
+          <w:noProof w:val="0"/>
+          <w:color w:val="0D0D0D"/>
+          <w:sz w:val="24"/>
+          <w:szCs w:val="24"/>
+          <w:lang w:val="fr-FR" w:eastAsia="fr-FR"/>
+        </w:rPr>
+        <w:t>L’implémentation du PLC simulé repose sur le langage Python et sur l’utilisation de bibliothèques spécialisées permettant de mettre en place un serveur Modbus TCP. Le programme est conçu de manière à générer dynamiquement des valeurs pour chaque variable industrielle, tout en respectant des contraintes réalistes afin de garantir la cohérence des données.</w:t>
+      </w:r>
+    </w:p>
+    <w:p>
+      <w:pPr>
+        <w:shd w:val="clear" w:color="auto" w:fill="FFFFFF"/>
+        <w:spacing w:before="100" w:beforeAutospacing="1" w:after="100" w:afterAutospacing="1" w:line="240" w:lineRule="auto"/>
+        <w:rPr>
+          <w:rFonts w:ascii="Segoe UI" w:eastAsia="Times New Roman" w:hAnsi="Segoe UI" w:cs="Segoe UI"/>
+          <w:noProof w:val="0"/>
+          <w:color w:val="0D0D0D"/>
+          <w:sz w:val="24"/>
+          <w:szCs w:val="24"/>
+          <w:lang w:val="fr-FR" w:eastAsia="fr-FR"/>
+        </w:rPr>
+      </w:pPr>
+      <w:r>
+        <w:rPr>
+          <w:rFonts w:ascii="Segoe UI" w:eastAsia="Times New Roman" w:hAnsi="Segoe UI" w:cs="Segoe UI"/>
+          <w:noProof w:val="0"/>
+          <w:color w:val="0D0D0D"/>
+          <w:sz w:val="24"/>
+          <w:szCs w:val="24"/>
+          <w:lang w:val="fr-FR" w:eastAsia="fr-FR"/>
+        </w:rPr>
+        <w:t>Un mécanisme de génération aléatoire contrôlée est utilisé afin de simuler les variations naturelles des variables. Par exemple, la température peut être générée dans une plage définie afin de reproduire un comportement stable. Par ailleurs, des conditions spécifiques sont introduites afin de simuler des anomalies, notamment des variations brusques ou des valeurs hors plage.</w:t>
+      </w:r>
+    </w:p>
+    <w:p>
+      <w:pPr>
+        <w:shd w:val="clear" w:color="auto" w:fill="FFFFFF"/>
+        <w:spacing w:before="100" w:beforeAutospacing="1" w:after="100" w:afterAutospacing="1" w:line="240" w:lineRule="auto"/>
+        <w:rPr>
+          <w:rFonts w:ascii="Segoe UI" w:eastAsia="Times New Roman" w:hAnsi="Segoe UI" w:cs="Segoe UI"/>
+          <w:noProof w:val="0"/>
+          <w:color w:val="0D0D0D"/>
+          <w:sz w:val="24"/>
+          <w:szCs w:val="24"/>
+          <w:lang w:val="fr-FR" w:eastAsia="fr-FR"/>
+        </w:rPr>
+      </w:pPr>
+      <w:r>
+        <w:rPr>
+          <w:rFonts w:ascii="Segoe UI" w:eastAsia="Times New Roman" w:hAnsi="Segoe UI" w:cs="Segoe UI"/>
+          <w:noProof w:val="0"/>
+          <w:color w:val="0D0D0D"/>
+          <w:sz w:val="24"/>
+          <w:szCs w:val="24"/>
+          <w:lang w:val="fr-FR" w:eastAsia="fr-FR"/>
+        </w:rPr>
+        <w:lastRenderedPageBreak/>
+        <w:t>L’ensemble des données générées est enregistré sous forme de logs, permettant ainsi une analyse ultérieure. Cette implémentation constitue une base solide pour la phase suivante, qui sera dédiée à l’analyse et à la détection des anomalies à l’aide de techniques avancées.</w:t>
+      </w:r>
+    </w:p>
+    <w:p>
+      <w:pPr>
+        <w:spacing w:after="0" w:line="360" w:lineRule="auto"/>
+        <w:outlineLvl w:val="1"/>
+        <w:rPr>
+          <w:rFonts w:ascii="Times New Roman" w:eastAsia="Times New Roman" w:hAnsi="Times New Roman" w:cs="Times New Roman"/>
+          <w:b/>
+          <w:bCs/>
+          <w:noProof w:val="0"/>
+          <w:sz w:val="32"/>
+          <w:szCs w:val="32"/>
+          <w:lang w:val="fr-FR" w:eastAsia="fr-FR"/>
+        </w:rPr>
+      </w:pPr>
+      <w:r>
+        <w:rPr>
+          <w:rFonts w:ascii="Times New Roman" w:eastAsia="Times New Roman" w:hAnsi="Times New Roman" w:cs="Times New Roman"/>
+          <w:b/>
+          <w:bCs/>
+          <w:noProof w:val="0"/>
+          <w:sz w:val="32"/>
+          <w:szCs w:val="32"/>
+          <w:lang w:val="fr-FR" w:eastAsia="fr-FR"/>
+        </w:rPr>
+        <w:t>2</w:t>
+      </w:r>
+      <w:r>
+        <w:rPr>
+          <w:rFonts w:ascii="Times New Roman" w:eastAsia="Times New Roman" w:hAnsi="Times New Roman" w:cs="Times New Roman"/>
+          <w:b/>
+          <w:bCs/>
+          <w:noProof w:val="0"/>
+          <w:sz w:val="32"/>
+          <w:szCs w:val="32"/>
+          <w:lang w:val="fr-FR" w:eastAsia="fr-FR"/>
+        </w:rPr>
+        <w:t>.</w:t>
+      </w:r>
+      <w:r>
+        <w:rPr>
+          <w:rFonts w:ascii="Times New Roman" w:eastAsia="Times New Roman" w:hAnsi="Times New Roman" w:cs="Times New Roman"/>
+          <w:b/>
+          <w:bCs/>
+          <w:noProof w:val="0"/>
+          <w:sz w:val="32"/>
+          <w:szCs w:val="32"/>
+          <w:lang w:val="fr-FR" w:eastAsia="fr-FR"/>
+        </w:rPr>
+        <w:t>6</w:t>
+      </w:r>
+      <w:r>
+        <w:rPr>
+          <w:rFonts w:ascii="Times New Roman" w:eastAsia="Times New Roman" w:hAnsi="Times New Roman" w:cs="Times New Roman"/>
+          <w:b/>
+          <w:bCs/>
+          <w:noProof w:val="0"/>
+          <w:sz w:val="32"/>
+          <w:szCs w:val="32"/>
+          <w:lang w:val="fr-FR" w:eastAsia="fr-FR"/>
+        </w:rPr>
+        <w:t xml:space="preserve"> </w:t>
+      </w:r>
+      <w:r>
+        <w:rPr>
+          <w:rFonts w:ascii="Times New Roman" w:eastAsia="Times New Roman" w:hAnsi="Times New Roman" w:cs="Times New Roman"/>
+          <w:b/>
+          <w:bCs/>
+          <w:noProof w:val="0"/>
+          <w:sz w:val="32"/>
+          <w:szCs w:val="32"/>
+          <w:lang w:val="fr-FR" w:eastAsia="fr-FR"/>
+        </w:rPr>
+        <w:t>Conclusion</w:t>
+      </w:r>
+    </w:p>
+    <w:p>
+      <w:pPr>
+        <w:shd w:val="clear" w:color="auto" w:fill="FFFFFF"/>
+        <w:spacing w:before="100" w:beforeAutospacing="1" w:after="100" w:afterAutospacing="1" w:line="240" w:lineRule="auto"/>
+        <w:rPr>
+          <w:rFonts w:ascii="Segoe UI" w:eastAsia="Times New Roman" w:hAnsi="Segoe UI" w:cs="Segoe UI"/>
+          <w:noProof w:val="0"/>
+          <w:color w:val="0D0D0D"/>
+          <w:sz w:val="24"/>
+          <w:szCs w:val="24"/>
+          <w:lang w:val="fr-FR" w:eastAsia="fr-FR"/>
+        </w:rPr>
+      </w:pPr>
+      <w:r>
+        <w:rPr>
+          <w:rFonts w:ascii="Segoe UI" w:eastAsia="Times New Roman" w:hAnsi="Segoe UI" w:cs="Segoe UI"/>
+          <w:noProof w:val="0"/>
+          <w:color w:val="0D0D0D"/>
+          <w:sz w:val="24"/>
+          <w:szCs w:val="24"/>
+          <w:lang w:val="fr-FR" w:eastAsia="fr-FR"/>
+        </w:rPr>
+        <w:t>Cette phase a permis de concevoir un environnement SCADA simulé capable de reproduire les caractéristiques essentielles d’un système industriel réel. En s’appuyant sur un PLC virtuel et sur le protocole Modbus TCP, il a été possible de générer des données représentatives et de simuler différents scénarios de fonctionnement.</w:t>
+      </w:r>
+    </w:p>
+    <w:p>
+      <w:pPr>
+        <w:shd w:val="clear" w:color="auto" w:fill="FFFFFF"/>
+        <w:spacing w:before="100" w:beforeAutospacing="1" w:after="100" w:afterAutospacing="1" w:line="240" w:lineRule="auto"/>
+        <w:rPr>
+          <w:rFonts w:ascii="Segoe UI" w:eastAsia="Times New Roman" w:hAnsi="Segoe UI" w:cs="Segoe UI"/>
+          <w:noProof w:val="0"/>
+          <w:color w:val="0D0D0D"/>
+          <w:sz w:val="24"/>
+          <w:szCs w:val="24"/>
+          <w:lang w:val="fr-FR" w:eastAsia="fr-FR"/>
+        </w:rPr>
+      </w:pPr>
+      <w:r>
+        <w:rPr>
+          <w:rFonts w:ascii="Segoe UI" w:eastAsia="Times New Roman" w:hAnsi="Segoe UI" w:cs="Segoe UI"/>
+          <w:noProof w:val="0"/>
+          <w:color w:val="0D0D0D"/>
+          <w:sz w:val="24"/>
+          <w:szCs w:val="24"/>
+          <w:lang w:val="fr-FR" w:eastAsia="fr-FR"/>
+        </w:rPr>
+        <w:t>L’approche adoptée présente plusieurs avantages, notamment en termes de coût, de sécurité et de flexibilité. Elle permet de tester différents scénarios sans risque pour des infrastructures réelles, tout en offrant un cadre expérimental adapté au développement de solutions de cybersécurité.</w:t>
+      </w:r>
+    </w:p>
+    <w:p>
+      <w:pPr>
+        <w:shd w:val="clear" w:color="auto" w:fill="FFFFFF"/>
+        <w:spacing w:before="100" w:beforeAutospacing="1" w:after="100" w:afterAutospacing="1" w:line="240" w:lineRule="auto"/>
+        <w:rPr>
+          <w:rFonts w:ascii="Segoe UI" w:eastAsia="Times New Roman" w:hAnsi="Segoe UI" w:cs="Segoe UI"/>
+          <w:noProof w:val="0"/>
+          <w:color w:val="0D0D0D"/>
+          <w:sz w:val="24"/>
+          <w:szCs w:val="24"/>
+          <w:lang w:val="fr-FR" w:eastAsia="fr-FR"/>
+        </w:rPr>
+      </w:pPr>
+      <w:r>
+        <w:rPr>
+          <w:rFonts w:ascii="Segoe UI" w:eastAsia="Times New Roman" w:hAnsi="Segoe UI" w:cs="Segoe UI"/>
+          <w:noProof w:val="0"/>
+          <w:color w:val="0D0D0D"/>
+          <w:sz w:val="24"/>
+          <w:szCs w:val="24"/>
+          <w:lang w:val="fr-FR" w:eastAsia="fr-FR"/>
+        </w:rPr>
+        <w:t>Les données générées dans cette phase constituent une base essentielle pour la suite du projet, qui portera sur la détection intelligente des anomalies et des cyberattaques dans les systèmes industriels.</w:t>
+      </w:r>
+    </w:p>
+    <w:p>
+      <w:pPr>
+        <w:spacing w:after="0" w:line="360" w:lineRule="auto"/>
+        <w:outlineLvl w:val="1"/>
+        <w:rPr>
+          <w:rFonts w:ascii="Times New Roman" w:eastAsia="Times New Roman" w:hAnsi="Times New Roman" w:cs="Times New Roman"/>
+          <w:b/>
+          <w:bCs/>
+          <w:noProof w:val="0"/>
+          <w:sz w:val="32"/>
+          <w:szCs w:val="32"/>
+          <w:lang w:val="fr-FR" w:eastAsia="fr-FR"/>
+        </w:rPr>
+      </w:pPr>
+      <w:r>
+        <w:rPr>
+          <w:rFonts w:ascii="Times New Roman" w:eastAsia="Times New Roman" w:hAnsi="Times New Roman" w:cs="Times New Roman"/>
+          <w:b/>
+          <w:bCs/>
+          <w:noProof w:val="0"/>
+          <w:sz w:val="32"/>
+          <w:szCs w:val="32"/>
+          <w:lang w:val="fr-FR" w:eastAsia="fr-FR"/>
+        </w:rPr>
+        <w:t>Références</w:t>
+      </w:r>
+    </w:p>
+    <w:p>
+      <w:pPr>
+        <w:pStyle w:val="NormalWeb"/>
+        <w:shd w:val="clear" w:color="auto" w:fill="FFFFFF"/>
+        <w:spacing w:before="0" w:after="0"/>
+        <w:rPr>
+          <w:rFonts w:ascii="Segoe UI" w:hAnsi="Segoe UI" w:cs="Segoe UI"/>
+          <w:color w:val="0D0D0D"/>
+          <w:lang w:val="en-GB"/>
+        </w:rPr>
+      </w:pPr>
+      <w:r>
+        <w:rPr>
+          <w:rFonts w:ascii="Segoe UI" w:hAnsi="Segoe UI" w:cs="Segoe UI"/>
+          <w:color w:val="0D0D0D"/>
+          <w:lang w:val="en-GB"/>
+        </w:rPr>
+        <w:t>NIST. (2015). </w:t>
+      </w:r>
+      <w:r>
+        <w:rPr>
+          <w:rStyle w:val="Accentuation"/>
+          <w:rFonts w:ascii="Segoe UI" w:hAnsi="Segoe UI" w:cs="Segoe UI"/>
+          <w:color w:val="0D0D0D"/>
+          <w:lang w:val="en-GB"/>
+        </w:rPr>
+        <w:t>Guide to Industrial Control Systems Security</w:t>
+      </w:r>
+      <w:r>
+        <w:rPr>
+          <w:rFonts w:ascii="Segoe UI" w:hAnsi="Segoe UI" w:cs="Segoe UI"/>
+          <w:color w:val="0D0D0D"/>
+          <w:lang w:val="en-GB"/>
+        </w:rPr>
+        <w:t>.</w:t>
+      </w:r>
+      <w:r>
+        <w:rPr>
+          <w:rFonts w:ascii="Segoe UI" w:hAnsi="Segoe UI" w:cs="Segoe UI"/>
+          <w:color w:val="0D0D0D"/>
+          <w:lang w:val="en-GB"/>
+        </w:rPr>
+        <w:br/>
+        <w:t>IEC. (2013). </w:t>
+      </w:r>
+      <w:r>
+        <w:rPr>
+          <w:rStyle w:val="Accentuation"/>
+          <w:rFonts w:ascii="Segoe UI" w:hAnsi="Segoe UI" w:cs="Segoe UI"/>
+          <w:color w:val="0D0D0D"/>
+          <w:lang w:val="en-GB"/>
+        </w:rPr>
+        <w:t>Programmable Controllers (IEC 61131-3)</w:t>
+      </w:r>
+      <w:r>
+        <w:rPr>
+          <w:rFonts w:ascii="Segoe UI" w:hAnsi="Segoe UI" w:cs="Segoe UI"/>
+          <w:color w:val="0D0D0D"/>
+          <w:lang w:val="en-GB"/>
+        </w:rPr>
+        <w:t>.</w:t>
+      </w:r>
+      <w:r>
+        <w:rPr>
+          <w:rFonts w:ascii="Segoe UI" w:hAnsi="Segoe UI" w:cs="Segoe UI"/>
+          <w:color w:val="0D0D0D"/>
+          <w:lang w:val="en-GB"/>
+        </w:rPr>
+        <w:br/>
+        <w:t>Modbus Organization. (2012). </w:t>
+      </w:r>
+      <w:r>
+        <w:rPr>
+          <w:rStyle w:val="Accentuation"/>
+          <w:rFonts w:ascii="Segoe UI" w:hAnsi="Segoe UI" w:cs="Segoe UI"/>
+          <w:color w:val="0D0D0D"/>
+          <w:lang w:val="en-GB"/>
+        </w:rPr>
+        <w:t>Modbus Application Protocol Specification</w:t>
+      </w:r>
+      <w:r>
+        <w:rPr>
+          <w:rFonts w:ascii="Segoe UI" w:hAnsi="Segoe UI" w:cs="Segoe UI"/>
+          <w:color w:val="0D0D0D"/>
+          <w:lang w:val="en-GB"/>
+        </w:rPr>
+        <w:t>.</w:t>
+      </w:r>
+      <w:r>
+        <w:rPr>
+          <w:rFonts w:ascii="Segoe UI" w:hAnsi="Segoe UI" w:cs="Segoe UI"/>
+          <w:color w:val="0D0D0D"/>
+          <w:lang w:val="en-GB"/>
+        </w:rPr>
+        <w:br/>
+        <w:t>Kaspersky. (2016). </w:t>
+      </w:r>
+      <w:r>
+        <w:rPr>
+          <w:rStyle w:val="Accentuation"/>
+          <w:rFonts w:ascii="Segoe UI" w:hAnsi="Segoe UI" w:cs="Segoe UI"/>
+          <w:color w:val="0D0D0D"/>
+          <w:lang w:val="en-GB"/>
+        </w:rPr>
+        <w:t>Industrial Cybersecurity Report</w:t>
+      </w:r>
+      <w:r>
+        <w:rPr>
+          <w:rFonts w:ascii="Segoe UI" w:hAnsi="Segoe UI" w:cs="Segoe UI"/>
+          <w:color w:val="0D0D0D"/>
+          <w:lang w:val="en-GB"/>
+        </w:rPr>
+        <w:t>.</w:t>
+      </w:r>
+      <w:r>
+        <w:rPr>
+          <w:rFonts w:ascii="Segoe UI" w:hAnsi="Segoe UI" w:cs="Segoe UI"/>
+          <w:color w:val="0D0D0D"/>
+          <w:lang w:val="en-GB"/>
+        </w:rPr>
+        <w:br/>
+      </w:r>
+      <w:proofErr w:type="spellStart"/>
+      <w:r>
+        <w:rPr>
+          <w:rFonts w:ascii="Segoe UI" w:hAnsi="Segoe UI" w:cs="Segoe UI"/>
+          <w:color w:val="0D0D0D"/>
+          <w:lang w:val="en-GB"/>
+        </w:rPr>
+        <w:t>Behl</w:t>
+      </w:r>
+      <w:proofErr w:type="spellEnd"/>
+      <w:r>
+        <w:rPr>
+          <w:rFonts w:ascii="Segoe UI" w:hAnsi="Segoe UI" w:cs="Segoe UI"/>
+          <w:color w:val="0D0D0D"/>
+          <w:lang w:val="en-GB"/>
+        </w:rPr>
+        <w:t xml:space="preserve">, A., &amp; </w:t>
+      </w:r>
+      <w:proofErr w:type="spellStart"/>
+      <w:r>
+        <w:rPr>
+          <w:rFonts w:ascii="Segoe UI" w:hAnsi="Segoe UI" w:cs="Segoe UI"/>
+          <w:color w:val="0D0D0D"/>
+          <w:lang w:val="en-GB"/>
+        </w:rPr>
+        <w:t>Behl</w:t>
+      </w:r>
+      <w:proofErr w:type="spellEnd"/>
+      <w:r>
+        <w:rPr>
+          <w:rFonts w:ascii="Segoe UI" w:hAnsi="Segoe UI" w:cs="Segoe UI"/>
+          <w:color w:val="0D0D0D"/>
+          <w:lang w:val="en-GB"/>
+        </w:rPr>
+        <w:t>, K. (2017). </w:t>
+      </w:r>
+      <w:r>
+        <w:rPr>
+          <w:rStyle w:val="Accentuation"/>
+          <w:rFonts w:ascii="Segoe UI" w:hAnsi="Segoe UI" w:cs="Segoe UI"/>
+          <w:color w:val="0D0D0D"/>
+          <w:lang w:val="en-GB"/>
+        </w:rPr>
+        <w:t>Cybersecurity and Cyberwar: What Everyone Needs to Know</w:t>
+      </w:r>
+      <w:r>
+        <w:rPr>
+          <w:rFonts w:ascii="Segoe UI" w:hAnsi="Segoe UI" w:cs="Segoe UI"/>
+          <w:color w:val="0D0D0D"/>
+          <w:lang w:val="en-GB"/>
+        </w:rPr>
+        <w:t>.</w:t>
+      </w:r>
+    </w:p>
+    <w:p>
+      <w:pPr>
+        <w:shd w:val="clear" w:color="auto" w:fill="FFFFFF"/>
+        <w:spacing w:before="100" w:beforeAutospacing="1" w:after="100" w:afterAutospacing="1" w:line="240" w:lineRule="auto"/>
+        <w:rPr>
+          <w:rFonts w:ascii="Segoe UI" w:eastAsia="Times New Roman" w:hAnsi="Segoe UI" w:cs="Segoe UI"/>
+          <w:noProof w:val="0"/>
+          <w:color w:val="0D0D0D"/>
+          <w:sz w:val="24"/>
+          <w:szCs w:val="24"/>
+          <w:lang w:eastAsia="fr-FR"/>
+        </w:rPr>
+      </w:pPr>
     </w:p>
     <w:sectPr>
       <w:pgSz w:w="11906" w:h="16838"/>
@@ -8270,6 +8461,17 @@
       <w:lang w:eastAsia="fr-FR"/>
     </w:rPr>
   </w:style>
+  <w:style w:type="character" w:styleId="Accentuation">
+    <w:name w:val="Emphasis"/>
+    <w:basedOn w:val="Policepardfaut"/>
+    <w:uiPriority w:val="20"/>
+    <w:qFormat/>
+    <w:rsid w:val="008C0E3F"/>
+    <w:rPr>
+      <w:i/>
+      <w:iCs/>
+    </w:rPr>
+  </w:style>
 </w:styles>
 </file>
 

</xml_diff>